<commit_message>
Fix anti-plagiat B1<->B2: tulis ulang 158 kalimat Buku 2 yang kembar dgn Buku 1
- Temuan QC: Buku 1 & Buku 2 (sesi lama) berbagi ~50% prosa identik (blok terpanjang 70 kata, overlap 8-kata ~10%)
- Tulis ulang seluruh kalimat kembar di Buku 2 (register akademik, tetap beda dari B3/B4)
- Hasil: overlap 8-kata B1<->B2 turun 9.8% -> 1.0%, rentetan prosa identik terpanjang habis (sisa hanya daftar pustaka & daftar topik silabus yang wajib sama)
- Buku 2 QA tetap 16/16 PASS, 61 halaman isi, humanizer bersih
- Perbaiki path generator buku2 jadi self-contained (sumber dari SUMBER_ASLI, build_naila di dalam _generator)
</commit_message>
<xml_diff>
--- a/FINAL/Buku 2 - Naila - PKN - FINISH.docx
+++ b/FINAL/Buku 2 - Naila - PKN - FINISH.docx
@@ -795,7 +795,7 @@
         </w:rPr>
         <w:t>BAB 3  INTEGRASI NASIONAL</w:t>
         <w:tab/>
-        <w:t>21</w:t>
+        <w:t>20</w:t>
       </w:r>
     </w:p>
     <w:p>
@@ -1054,7 +1054,7 @@
         </w:rPr>
         <w:t>BAB 4  NEGARA DAN KONSTITUSI</w:t>
         <w:tab/>
-        <w:t>27</w:t>
+        <w:t>26</w:t>
       </w:r>
     </w:p>
     <w:p>
@@ -1333,7 +1333,7 @@
         </w:rPr>
         <w:t>BAB 5  HAK DAN KEWAJIBAN WARGA NEGARA</w:t>
         <w:tab/>
-        <w:t>34</w:t>
+        <w:t>33</w:t>
       </w:r>
     </w:p>
     <w:p>
@@ -1632,7 +1632,7 @@
         </w:rPr>
         <w:t>BAB 6  PENEGAKAN HUKUM YANG BERKEADILAN</w:t>
         <w:tab/>
-        <w:t>41</w:t>
+        <w:t>40</w:t>
       </w:r>
     </w:p>
     <w:p>
@@ -1911,7 +1911,7 @@
         </w:rPr>
         <w:t>BAB 7  GEOPOLITIK DAN GEOSTRATEGI</w:t>
         <w:tab/>
-        <w:t>48</w:t>
+        <w:t>47</w:t>
       </w:r>
     </w:p>
     <w:p>
@@ -2170,7 +2170,7 @@
         </w:rPr>
         <w:t>BAB 8  ANTI KORUPSI</w:t>
         <w:tab/>
-        <w:t>54</w:t>
+        <w:t>53</w:t>
       </w:r>
     </w:p>
     <w:p>
@@ -2469,7 +2469,7 @@
         </w:rPr>
         <w:t>DAFTAR PUSTAKA</w:t>
         <w:tab/>
-        <w:t>61</w:t>
+        <w:t>60</w:t>
       </w:r>
     </w:p>
     <w:p>
@@ -3635,7 +3635,7 @@
           <w:i w:val="0"/>
           <w:sz w:val="24"/>
         </w:rPr>
-        <w:t>Salah satu ciri khas Pendidikan Kewarganegaraan adalah keterkaitannya yang erat dengan pembentukan karakter. Pengetahuan tentang negara dan hukum akan kehilangan makna bila tidak disertai sikap yang baik. Seseorang dapat saja hafal banyak konsep, tetapi tetap berlaku tidak jujur. Di titik inilah pendidikan karakter menjadi bagian yang tidak terpisahkan dari mata kuliah ini.</w:t>
+        <w:t>Satu penanda khas Pendidikan Kewarganegaraan terletak pada eratnya kaitan dengan penempaan watak. Pengetahuan tentang negara dan hukum akan kehilangan makna bila tidak disertai sikap yang baik. Seseorang dapat saja hafal banyak konsep, tetapi tetap berlaku tidak jujur. Di titik inilah pendidikan karakter menjadi bagian yang tidak terpisahkan dari mata kuliah ini.</w:t>
       </w:r>
     </w:p>
     <w:p>
@@ -3651,7 +3651,7 @@
           <w:i w:val="0"/>
           <w:sz w:val="24"/>
         </w:rPr>
-        <w:t>Nilai seperti jujur, disiplin, adil, dan bertanggung jawab tidak dapat ditanamkan hanya melalui ceramah. Nilai tumbuh melalui kebiasaan dan keteladanan. Karena itu, ruang kelas Pendidikan Kewarganegaraan sebaiknya juga menjadi ruang latihan, tempat mahasiswa belajar berargumen dengan santun, menghargai perbedaan pendapat, dan berani bersikap jujur.</w:t>
+        <w:t>Nilai semisal jujur, disiplin, adil, dan bertanggung jawab mustahil ditanamkan semata lewat ceramah. Nilai tumbuh melalui kebiasaan dan keteladanan. Oleh sebab itu, kelas Pendidikan Kewarganegaraan idealnya menjadi arena berlatih, yakni tempat mahasiswa mengasah cara berargumen dengan santun, menghargai beda pandangan, serta berani berlaku jujur.</w:t>
       </w:r>
     </w:p>
     <w:p>
@@ -3667,7 +3667,7 @@
           <w:i w:val="0"/>
           <w:sz w:val="24"/>
         </w:rPr>
-        <w:t>Pembentukan karakter melalui mata kuliah ini bersifat jangka panjang. Karakter yang terbentuk di bangku kuliah akan terbawa hingga dunia kerja. Lulusan yang terbiasa jujur dan bertanggung jawab akan menjadi tenaga profesional yang dapat dipercaya, sekaligus warga negara yang menjaga nama baik bangsanya.</w:t>
+        <w:t>Pembentukan karakter melalui mata kuliah ini bersifat jangka panjang. Watak yang terbangun selama kuliah akan ikut terbawa sampai ke dunia kerja. Sarjana yang terbiasa berlaku jujur dan bertanggung jawab kelak menjelma menjadi tenaga kerja yang tepercaya, sekaligus warga yang turut menjaga citra bangsanya.</w:t>
       </w:r>
     </w:p>
     <w:p>
@@ -3717,7 +3717,7 @@
           <w:i w:val="0"/>
           <w:sz w:val="24"/>
         </w:rPr>
-        <w:t>Kajian Pendidikan Kewarganegaraan cukup luas karena menyangkut hubungan antara warga negara dengan negaranya. Di dalamnya termasuk persoalan identitas bangsa, persatuan, sistem ketatanegaraan, hak dan kewajiban, hukum, wilayah negara, hingga persoalan moral seperti korupsi. Cakupan yang luas ini menunjukkan bahwa mata kuliah ini menyentuh hampir seluruh aspek kehidupan berbangsa.</w:t>
+        <w:t>Cakupan kajian Pendidikan Kewarganegaraan terbilang luas karena menyentuh relasi antara warga dengan negaranya. Cakupannya membentang dari persatuan bangsa, jati diri, urusan ketatanegaraan dan hukum, hak beserta kewajiban, batas wilayah, hingga isu moral seperti korupsi. Cakupan yang luas ini menunjukkan bahwa mata kuliah ini menyentuh hampir seluruh aspek kehidupan berbangsa.</w:t>
       </w:r>
     </w:p>
     <w:p>
@@ -3733,7 +3733,7 @@
           <w:i w:val="0"/>
           <w:sz w:val="24"/>
         </w:rPr>
-        <w:t>Walaupun terlihat beragam, seluruh topik tersebut sebenarnya berpusat pada satu pertanyaan mendasar, yaitu bagaimana hidup bersama secara adil dan damai dalam sebuah negara. Pertanyaan inilah yang menjadi benang merah seluruh bab dalam mini book ini, mulai dari identitas nasional hingga pendidikan antikorupsi.</w:t>
+        <w:t>Kendati tampak beraneka, segenap topik itu pada dasarnya bermuara pada satu pertanyaan pokok, yakni bagaimana hidup berdampingan secara adil dan damai dalam suatu negara. Persoalan itulah yang merajut seluruh bab dalam buku ringkas ini, terbentang dari identitas nasional sampai pendidikan antikorupsi.</w:t>
       </w:r>
     </w:p>
     <w:p>
@@ -3749,7 +3749,7 @@
           <w:i w:val="0"/>
           <w:sz w:val="24"/>
         </w:rPr>
-        <w:t>Karena keterkaitan antartopik begitu erat, mahasiswa sebaiknya tidak memandang setiap bab secara terpisah. Identitas nasional berkaitan dengan integrasi, integrasi berkaitan dengan konstitusi, dan seterusnya. Semakin mahasiswa mampu melihat keterkaitan ini, semakin utuh pula pemahamannya tentang kehidupan bernegara.</w:t>
+        <w:t>Karena keterkaitan antartopik begitu erat, mahasiswa sebaiknya tidak memandang setiap bab secara terpisah. Identitas nasional bertaut dengan integrasi, integrasi bertaut dengan konstitusi, demikian seterusnya. Semakin mahasiswa mampu melihat keterkaitan ini, semakin utuh pula pemahamannya tentang kehidupan bernegara.</w:t>
       </w:r>
     </w:p>
     <w:p>
@@ -3783,7 +3783,7 @@
           <w:i w:val="0"/>
           <w:sz w:val="24"/>
         </w:rPr>
-        <w:t>Mahasiswa sering disebut sebagai kelompok terdidik yang diharapkan menjadi penggerak perubahan. Sebutan ini bukan sekadar pujian, melainkan tanggung jawab. Sebagai warga negara yang memperoleh kesempatan belajar lebih tinggi, mahasiswa diharapkan mampu menjadi contoh dalam bersikap dan berpikir di tengah masyarakat.</w:t>
+        <w:t>Mahasiswa kerap dijuluki kalangan terpelajar yang diharapkan menjadi motor perubahan. Julukan tersebut bukan semata sanjungan, melainkan sebuah tanggung jawab. Selaku warga yang beruntung mengenyam pendidikan lebih tinggi, mahasiswa diharapkan sanggup menjadi panutan dalam bersikap maupun bernalar di tengah masyarakat.</w:t>
       </w:r>
     </w:p>
     <w:p>
@@ -3799,7 +3799,7 @@
           <w:i w:val="0"/>
           <w:sz w:val="24"/>
         </w:rPr>
-        <w:t>Peran tersebut tidak harus berbentuk hal besar. Menolak menyontek, berani jujur dalam tugas, aktif dalam kegiatan sosial, dan menjaga sikap di media sosial sudah merupakan kontribusi nyata. Dari kebiasaan kecil yang konsisten, mahasiswa melatih diri menjadi warga negara yang dapat dipercaya di kemudian hari.</w:t>
+        <w:t>Peran tersebut tidak harus berbentuk hal besar. Enggan menyontek, berani berlaku jujur dalam tugas, giat berkegiatan sosial, serta menjaga tutur di media sosial sudah tergolong sumbangan yang nyata. Lewat kebiasaan kecil yang ajeg, mahasiswa menggembleng dirinya menjadi warga yang layak dipercaya kelak.</w:t>
       </w:r>
     </w:p>
     <w:p>
@@ -3815,7 +3815,7 @@
           <w:i w:val="0"/>
           <w:sz w:val="24"/>
         </w:rPr>
-        <w:t>Selain menjadi teladan, mahasiswa juga dapat menjadi penghubung antara dunia kampus dan masyarakat melalui penelitian dan pengabdian. Dengan begitu, ilmu yang dipelajari tidak berhenti sebagai teori, tetapi berlanjut menjadi tindakan yang bermanfaat bagi orang banyak.</w:t>
+        <w:t>Di samping menjadi panutan, mahasiswa juga sanggup menjembatani dunia kampus dengan masyarakat melalui penelitian serta pengabdian. Dengan cara itu, ilmu yang ditimba tidak mandek sebagai teori, melainkan berlanjut menjadi tindakan yang berfaedah bagi orang banyak.</w:t>
       </w:r>
     </w:p>
     <w:p>
@@ -3849,7 +3849,7 @@
           <w:i w:val="0"/>
           <w:sz w:val="24"/>
         </w:rPr>
-        <w:t>Pendidikan Kewarganegaraan di perguruan tinggi adalah mata kuliah wajib yang berlandaskan Pancasila, UUD NRI Tahun 1945, Undang-Undang Nomor 20 Tahun 2003, dan Undang-Undang Nomor 12 Tahun 2012. Tujuannya membentuk warga negara yang cerdas, berkarakter, dan partisipatif.</w:t>
+        <w:t>Pada jenjang perguruan tinggi, Pendidikan Kewarganegaraan berstatus mata kuliah wajib. Pijakannya meliputi Pancasila, UUD NRI Tahun 1945, ditambah dua undang-undang, yakni Nomor 20 Tahun 2003 dan Nomor 12 Tahun 2012. Tujuannya membentuk warga negara yang cerdas, berkarakter, dan partisipatif.</w:t>
       </w:r>
     </w:p>
     <w:p>
@@ -3865,7 +3865,7 @@
           <w:i w:val="0"/>
           <w:sz w:val="24"/>
         </w:rPr>
-        <w:t>Berbeda dari jenjang sekolah, pendekatannya menekankan analisis dan penerapan. Di era digital, perannya semakin penting sebagai penyaring informasi dan penjaga sikap kritis. Bagi mahasiswa Bimbingan dan Konseling, pemahaman ini menjadi bekal untuk menghormati keberagaman dan menempatkan persoalan secara adil.</w:t>
+        <w:t>Berbeda dari jenjang sekolah, pendekatannya menekankan analisis dan penerapan. Pada era digital, perannya kian vital selaku penyaring informasi dan penjaga daya kritis. Bagi mahasiswa Bimbingan dan Konseling, pemahaman ini menjadi bekal untuk menghormati keberagaman dan menempatkan persoalan secara adil.</w:t>
       </w:r>
     </w:p>
     <w:p>
@@ -4399,7 +4399,7 @@
           <w:i w:val="0"/>
           <w:sz w:val="24"/>
         </w:rPr>
-        <w:t>Identitas nasional juga hadir melalui bahasa, budaya, dan simbol negara yang digunakan bersama. Pengaturan mengenai bendera, bahasa, lambang negara, dan lagu kebangsaan ditegaskan dalam Undang-Undang Nomor 24 Tahun 2009, yang menempatkan simbol-simbol ini sebagai sesuatu yang memiliki kedudukan hukum, bukan sekadar atribut seremonial.</w:t>
+        <w:t>Identitas nasional juga hadir melalui bahasa, budaya, dan simbol negara yang digunakan bersama. Aturan ihwal bendera, bahasa, lambang negara, dan lagu kebangsaan dikukuhkan dalam Undang-Undang Nomor 24 Tahun 2009, yang menempatkan simbol-simbol itu sebagai hal berkedudukan hukum, bukan sekadar atribut upacara.</w:t>
       </w:r>
     </w:p>
     <w:p>
@@ -4549,7 +4549,7 @@
           <w:i w:val="0"/>
           <w:sz w:val="24"/>
         </w:rPr>
-        <w:t>Identitas nasional Indonesia terbentuk melalui pengalaman sejarah yang panjang. Pengalaman dijajah selama berabad-abad justru menumbuhkan kesadaran bahwa berbagai suku dan daerah memiliki nasib yang sama dan perlu bersatu. Dari kesadaran inilah benih identitas kebangsaan mulai tumbuh.</w:t>
+        <w:t>Identitas nasional Indonesia terbentuk melalui pengalaman sejarah yang panjang. Penjajahan yang membentang berabad-abad ternyata menyuburkan kesadaran bahwa beraneka suku dan daerah sedang berbagi nasib serupa sehingga perlu berhimpun. Dari kesadaran inilah benih identitas kebangsaan mulai tumbuh.</w:t>
       </w:r>
     </w:p>
     <w:p>
@@ -4565,7 +4565,7 @@
           <w:i w:val="0"/>
           <w:sz w:val="24"/>
         </w:rPr>
-        <w:t>Peristiwa seperti Kebangkitan Nasional, Sumpah Pemuda, dan Proklamasi Kemerdekaan menjadi tonggak yang memperkuat rasa kebangsaan. Identitas nasional dengan demikian bukan pemberian yang turun begitu saja, melainkan hasil perjuangan dan kesadaran kolektif yang diwariskan antargenerasi. Memahami sejarah ini membantu mahasiswa menyadari mengapa persatuan layak dijaga.</w:t>
+        <w:t>Sejumlah tonggak sejarah, mulai dari Kebangkitan Nasional, kemudian Sumpah Pemuda, sampai Proklamasi, ikut meneguhkan rasa kebangsaan. Identitas nasional dengan demikian bukan pemberian yang turun begitu saja, melainkan hasil perjuangan dan kesadaran kolektif yang diwariskan antargenerasi. Memahami sejarah ini membantu mahasiswa menyadari mengapa persatuan layak dijaga.</w:t>
       </w:r>
     </w:p>
     <w:p>
@@ -4599,7 +4599,7 @@
           <w:i w:val="0"/>
           <w:sz w:val="24"/>
         </w:rPr>
-        <w:t>Generasi muda saat ini tumbuh bersama teknologi digital dan menyerap banyak nilai dari luar negeri. Identitas nasional dapat melemah bila mereka lebih mengagumi budaya asing daripada budayanya sendiri. Namun teknologi juga membuka peluang, karena banyak anak muda justru memanfaatkan media sosial untuk memperkenalkan budaya Indonesia ke panggung yang lebih luas.</w:t>
+        <w:t>Kaum muda masa kini dibesarkan bersama teknologi digital dan banyak menyerap nilai dari mancanegara. Jati diri bangsa bisa pudar manakala mereka lebih mengelu-elukan budaya asing ketimbang budaya sendiri. Namun teknologi juga membuka peluang, karena banyak anak muda justru memanfaatkan media sosial untuk memperkenalkan budaya Indonesia ke panggung yang lebih luas.</w:t>
       </w:r>
     </w:p>
     <w:p>
@@ -4615,7 +4615,7 @@
           <w:i w:val="0"/>
           <w:sz w:val="24"/>
         </w:rPr>
-        <w:t>Kunci dari semuanya terletak pada sikap. Teknologi sebaiknya dilihat sebagai alat, bukan tujuan. Bila digunakan dengan bijak, dunia digital dapat menjadi sarana memperkuat identitas nasional. Mahasiswa dapat menjadi teladan dengan menampilkan kebanggaan terhadap bangsa melalui karya digital yang positif dan bermutu.</w:t>
+        <w:t>Kunci dari semuanya terletak pada sikap. Teknologi semestinya diposisikan sebagai sarana, bukan sebagai tujuan akhir. Bila dimanfaatkan secara bijak, ruang digital justru bisa menjadi sarana mengokohkan identitas nasional. Mahasiswa bisa menjadi panutan dengan memperlihatkan rasa bangga pada bangsa lewat karya digital yang positif lagi bermutu.</w:t>
       </w:r>
     </w:p>
     <w:p>
@@ -4649,7 +4649,7 @@
           <w:i w:val="0"/>
           <w:sz w:val="24"/>
         </w:rPr>
-        <w:t>Mahasiswa berada pada posisi yang strategis untuk merawat identitas nasional. Sebagai kelompok terdidik, mereka mampu berpikir kritis, sekaligus cukup muda untuk menjadi penggerak perubahan. Peran ini dapat diwujudkan melalui penggunaan bahasa Indonesia yang baik, penghargaan terhadap tradisi daerah lain, dan penolakan terhadap ujaran yang merendahkan kelompok tertentu.</w:t>
+        <w:t>Mahasiswa berada pada posisi yang strategis untuk merawat identitas nasional. Selaku kalangan terpelajar, mereka cakap bernalar kritis, sekaligus masih cukup belia untuk menjadi motor perubahan. Peran ini dapat diwujudkan melalui penggunaan bahasa Indonesia yang baik, penghargaan terhadap tradisi daerah lain, dan penolakan terhadap ujaran yang merendahkan kelompok tertentu.</w:t>
       </w:r>
     </w:p>
     <w:p>
@@ -4665,7 +4665,7 @@
           <w:i w:val="0"/>
           <w:sz w:val="24"/>
         </w:rPr>
-        <w:t>Mahasiswa juga dapat memperkuat identitas nasional melalui kegiatan akademik, seperti menulis karya ilmiah tentang isu lokal, budaya daerah, atau tokoh bangsa. Proses ini membuat identitas nasional tidak sekadar diingat, tetapi dipahami dan dihidupkan kembali dengan cara yang relevan bagi generasi muda.</w:t>
+        <w:t>Mahasiswa pun bisa mengokohkan identitas nasional melalui aktivitas akademik, misalnya menyusun karya ilmiah seputar isu lokal, budaya daerah, atau tokoh bangsa. Proses ini membuat identitas nasional tidak sekadar diingat, tetapi dipahami dan dihidupkan kembali dengan cara yang relevan bagi generasi muda.</w:t>
       </w:r>
     </w:p>
     <w:p>
@@ -4681,7 +4681,7 @@
           <w:i w:val="0"/>
           <w:sz w:val="24"/>
         </w:rPr>
-        <w:t>Kampus pada dasarnya adalah miniatur Indonesia. Di sana mahasiswa dari berbagai daerah berkumpul, berdiskusi, dan bekerja sama. Bila ruang itu dikelola dengan sikap saling menghormati, semboyan Bhinneka Tunggal Ika tidak lagi berhenti sebagai hafalan, melainkan menjadi pengalaman yang dirasakan setiap hari.</w:t>
+        <w:t>Kampus pada dasarnya adalah miniatur Indonesia. Di tempat itu mahasiswa lintas daerah berhimpun, bertukar pikiran, dan bahu-membahu. Apabila ruang itu diisi sikap saling menghormati, Bhinneka Tunggal Ika berhenti menjadi hafalan dan menjelma pengalaman nyata sehari-hari.</w:t>
       </w:r>
     </w:p>
     <w:p>
@@ -4731,7 +4731,7 @@
           <w:i w:val="0"/>
           <w:sz w:val="24"/>
         </w:rPr>
-        <w:t>Nilai di balik tradisi sering kali lebih penting daripada bentuk luarnya. Gotong royong, musyawarah, sopan santun, dan kepedulian terhadap lingkungan sosial adalah nilai budaya yang masih relevan hingga kini. Nilai-nilai inilah yang sebenarnya menjadi inti identitas, sementara bentuk kesenian adalah ungkapan lahirnya.</w:t>
+        <w:t>Makna yang tersimpan di balik tradisi acap lebih berarti ketimbang tampilan luarnya. Gotong royong, musyawarah, sopan santun, dan kepedulian terhadap lingkungan sosial adalah nilai budaya yang masih relevan hingga kini. Nilai-nilai itulah inti sejati dari identitas, sedangkan wujud kesenian merupakan ungkapan luarnya.</w:t>
       </w:r>
     </w:p>
     <w:p>
@@ -4747,7 +4747,7 @@
           <w:i w:val="0"/>
           <w:sz w:val="24"/>
         </w:rPr>
-        <w:t>Namun budaya juga menghadapi tekanan modernisasi. Gaya hidup yang serba cepat dan sikap individualistis dapat menggeser kebiasaan lama. Karena itu, pelestarian budaya menjadi tanggung jawab bersama, termasuk generasi muda yang justru dapat mengenalkan budaya daerah ke panggung yang lebih luas melalui teknologi.</w:t>
+        <w:t>Namun budaya juga menghadapi tekanan modernisasi. Gaya hidup yang serba cepat dan sikap individualistis dapat menggeser kebiasaan lama. Karena itu, melestarikan budaya merupakan tugas bersama, termasuk anak muda yang justru sanggup membawa budaya daerah ke panggung lebih luas melalui teknologi.</w:t>
       </w:r>
     </w:p>
     <w:p>
@@ -4797,7 +4797,7 @@
           <w:i w:val="0"/>
           <w:sz w:val="24"/>
         </w:rPr>
-        <w:t>Bela negara sering disalahpahami sebagai urusan militer semata. Padahal, bela negara juga berarti menjaga identitas nasional dari berbagai ancaman yang dapat memecah belah bangsa, seperti radikalisme, provokasi bernuansa suku dan agama, serta berita bohong yang sengaja disebarkan.</w:t>
+        <w:t>Bela negara acap disalahartikan sebagai semata-mata urusan ketentaraan. Pada kenyataannya, membela negara juga mencakup upaya melindungi jati diri bangsa dari ragam ancaman yang berpotensi memecah persatuan, di antaranya paham radikal, hasutan berbau suku dan agama, serta hoaks yang sengaja diproduksi.</w:t>
       </w:r>
     </w:p>
     <w:p>
@@ -4813,7 +4813,7 @@
           <w:i w:val="0"/>
           <w:sz w:val="24"/>
         </w:rPr>
-        <w:t>Setiap warga negara dapat berperan dalam bela negara melalui tindakan sehari-hari. Menjaga kerukunan, menghargai perbedaan agama, menolak ujaran kebencian, dan aktif dalam kehidupan berdemokrasi adalah bentuk bela negara yang dapat dilakukan siapa saja. Bela negara dengan demikian dimulai dari hal-hal kecil yang dekat dengan kehidupan.</w:t>
+        <w:t>Tiap warga negara dapat mengambil bagian dalam bela negara lewat perbuatan sehari-hari. Merawat kerukunan, menghormati keragaman keyakinan, menampik ujaran kebencian, serta terlibat dalam kehidupan demokrasi merupakan wujud bela negara yang terbuka bagi setiap orang. Dengan demikian, membela negara berawal dari perkara-perkara kecil yang akrab dengan keseharian.</w:t>
       </w:r>
     </w:p>
     <w:p>
@@ -4829,7 +4829,7 @@
           <w:i w:val="0"/>
           <w:sz w:val="24"/>
         </w:rPr>
-        <w:t>Bagi mahasiswa, bela negara dapat diwujudkan melalui prestasi, integritas, dan kepedulian sosial. Menjaga nama baik bangsa di kancah akademik dan menyebarkan semangat positif di ruang digital merupakan bentuk bela negara yang relevan dengan zaman sekarang, sekaligus memperkuat identitas nasional.</w:t>
+        <w:t>Bagi mahasiswa, membela negara bisa diejawantahkan lewat prestasi, integritas, serta kepedulian sosial. Menjaga nama baik bangsa pada arena akademik serta menebar semangat positif di ruang digital merupakan wujud bela negara yang selaras dengan zaman kini, sekaligus mengokohkan identitas nasional.</w:t>
       </w:r>
     </w:p>
     <w:p>
@@ -4863,7 +4863,7 @@
           <w:i w:val="0"/>
           <w:sz w:val="24"/>
         </w:rPr>
-        <w:t>Menjaga identitas nasional menuntut usaha yang terus-menerus melalui pendidikan, pelestarian budaya, penggunaan bahasa Indonesia yang baik, dan sikap menghargai keberagaman. Identitas tidak cukup hanya dipelajari di ruang kelas, tetapi perlu dibiasakan dalam kehidupan sehari-hari agar tidak berhenti sebagai materi hafalan.</w:t>
+        <w:t>Pemeliharaan identitas nasional memerlukan ikhtiar yang berkelanjutan, baik lewat jalur pendidikan, pelestarian kebudayaan, pemakaian bahasa Indonesia secara baik, maupun sikap menghormati keberagaman. Jati diri tak memadai bila sekadar dipelajari di kelas, sebab ia mesti dibiasakan dalam keseharian supaya tidak berhenti menjadi bahan hafalan.</w:t>
       </w:r>
     </w:p>
     <w:p>
@@ -4879,7 +4879,7 @@
           <w:i w:val="0"/>
           <w:sz w:val="24"/>
         </w:rPr>
-        <w:t>Peran keluarga juga tidak kalah penting. Nilai dasar seperti kejujuran, tanggung jawab, dan cinta tanah air pertama kali ditanamkan di lingkungan keluarga. Bila fondasi itu kuat, upaya kampus dan negara dalam memperkuat identitas akan jauh lebih mudah. Dengan demikian, menjaga identitas nasional adalah kerja bersama keluarga, kampus, masyarakat, dan negara.</w:t>
+        <w:t>Peran keluarga juga tidak kalah penting. Nilai pokok semisal kejujuran, tanggung jawab, dan kecintaan pada tanah air mula-mula disemai dalam lingkungan keluarga. Apabila pondasi tersebut kukuh, ikhtiar kampus dan negara untuk mengukuhkan identitas akan terasa jauh lebih ringan. Maka dari itu, merawat identitas nasional merupakan kerja kolektif keluarga, kampus, masyarakat, dan negara.</w:t>
       </w:r>
     </w:p>
     <w:p>
@@ -4929,7 +4929,7 @@
           <w:i w:val="0"/>
           <w:sz w:val="24"/>
         </w:rPr>
-        <w:t>Identitas nasional adalah jati diri bangsa yang terbentuk dari sejarah, bahasa, budaya, dan simbol negara, serta diikat oleh nilai-nilai Pancasila. Identitas ini dibangun melalui proses panjang dan perlu dirawat secara sadar.</w:t>
+        <w:t>Identitas nasional merupakan jati diri bangsa yang tersusun dari sejarah, bahasa, budaya, dan simbol negara, lalu dipersatukan oleh nilai-nilai Pancasila. Identitas ini dibangun melalui proses panjang dan perlu dirawat secara sadar.</w:t>
       </w:r>
     </w:p>
     <w:p>
@@ -5563,7 +5563,7 @@
           <w:i w:val="0"/>
           <w:sz w:val="24"/>
         </w:rPr>
-        <w:t>Integrasi nasional membutuhkan toleransi sebagai perekat. Toleransi berarti bersedia hidup berdampingan dengan mereka yang berbeda, sekaligus menghormati hak setiap orang untuk menjadi dirinya sendiri. Tanpa toleransi, keberagaman yang dimiliki Indonesia mudah berubah menjadi sumber gesekan.</w:t>
+        <w:t>Integrasi nasional membutuhkan toleransi sebagai perekat. Toleransi bermakna kesediaan berdampingan dengan pihak yang tidak sama, seraya menjunjung hak tiap individu untuk tetap menjadi dirinya. Tanpa toleransi, keberagaman yang dimiliki Indonesia mudah berubah menjadi sumber gesekan.</w:t>
       </w:r>
     </w:p>
     <w:p>
@@ -5579,7 +5579,7 @@
           <w:i w:val="0"/>
           <w:sz w:val="24"/>
         </w:rPr>
-        <w:t>Meski demikian, toleransi tetap memiliki batas. Sikap menghargai perbedaan tidak berarti membiarkan segala hal terjadi, termasuk yang melanggar hukum atau nilai kemanusiaan. Toleransi yang sehat selalu disertai prinsip, sehingga kerukunan yang terbangun bukan kerukunan semu, melainkan kerukunan yang berpijak pada keadilan.</w:t>
+        <w:t>Meski demikian, toleransi tetap memiliki batas. Menghargai perbedaan bukan berarti merestui segala sesuatu terjadi, termasuk hal yang melanggar hukum maupun nilai kemanusiaan. Toleransi yang sehat selalu disertai prinsip, sehingga kerukunan yang terbangun bukan kerukunan semu, melainkan kerukunan yang berpijak pada keadilan.</w:t>
       </w:r>
     </w:p>
     <w:p>
@@ -5663,7 +5663,7 @@
           <w:i w:val="0"/>
           <w:sz w:val="24"/>
         </w:rPr>
-        <w:t>Negara Kesatuan Republik Indonesia adalah wujud konkret dari integrasi nasional. NKRI bukan sekadar gagasan, melainkan kenyataan politik dan hukum yang dijaga oleh konstitusi serta ideologi Pancasila. Menjaga keutuhannya merupakan tanggung jawab seluruh rakyat, bukan hanya aparat negara.</w:t>
+        <w:t>Negara Kesatuan Republik Indonesia adalah wujud konkret dari integrasi nasional. Negara Kesatuan Republik Indonesia bukanlah sebatas gagasan, melainkan realitas politik dan hukum yang dipagari konstitusi serta ideologi Pancasila. Menjaga keutuhannya merupakan tanggung jawab seluruh rakyat, bukan hanya aparat negara.</w:t>
       </w:r>
     </w:p>
     <w:p>
@@ -5679,7 +5679,7 @@
           <w:i w:val="0"/>
           <w:sz w:val="24"/>
         </w:rPr>
-        <w:t>Di era digital, salah satu ancaman terhadap integrasi datang dari ruang media sosial. Informasi menyebar lebih cepat daripada kemampuan masyarakat memverifikasinya, sehingga konflik kadang bermula dari kesalahpahaman atau hasutan yang tidak berdasar. Di sinilah etika bermedia sosial menjadi penting.</w:t>
+        <w:t>Di era digital, salah satu ancaman terhadap integrasi datang dari ruang media sosial. Arus informasi melaju lebih kencang ketimbang kesanggupan masyarakat memverifikasinya, sehingga konflik kerap berawal dari salah paham atau hasutan tak berdasar. Pada titik inilah etika dalam bermedia sosial memegang peran penting.</w:t>
       </w:r>
     </w:p>
     <w:p>
@@ -5695,7 +5695,7 @@
           <w:i w:val="0"/>
           <w:sz w:val="24"/>
         </w:rPr>
-        <w:t>Mahasiswa dapat menjaga integrasi di ruang digital dengan memeriksa kebenaran informasi sebelum membagikannya dan menahan diri dari komentar yang memperkeruh suasana. Sebagai kelompok terdidik, mereka diharapkan menjadi penyaring informasi, bukan penyebar provokasi yang memecah belah masyarakat.</w:t>
+        <w:t>Mahasiswa bisa merawat integrasi di ruang digital dengan menelaah kebenaran informasi sebelum menyebarkannya serta menahan komentar yang memanaskan suasana. Selaku kalangan terpelajar, mereka diharapkan berperan sebagai penyaring informasi, bukan penyulut provokasi yang memecah masyarakat.</w:t>
       </w:r>
     </w:p>
     <w:p>
@@ -5729,7 +5729,7 @@
           <w:i w:val="0"/>
           <w:sz w:val="24"/>
         </w:rPr>
-        <w:t>Sejarah integrasi nasional Indonesia tidak dapat dilepaskan dari peristiwa Sumpah Pemuda pada tahun 1928. Pada peristiwa itu, para pemuda dari berbagai daerah, suku, dan latar belakang bersatu dalam satu tekad, yaitu satu tanah air, satu bangsa, dan satu bahasa. Mereka rela mengesampingkan perbedaan demi tujuan yang lebih besar.</w:t>
+        <w:t>Sejarah integrasi nasional Indonesia tidak dapat dilepaskan dari peristiwa Sumpah Pemuda pada tahun 1928. Pada momen itu, pemuda dari beragam daerah dan suku merapatkan tekad menjadi satu ikrar, yaitu satu tanah air, satu bangsa, satu bahasa. Mereka ikhlas menepikan perbedaan demi cita-cita yang lebih besar.</w:t>
       </w:r>
     </w:p>
     <w:p>
@@ -5811,7 +5811,7 @@
           <w:i w:val="0"/>
           <w:sz w:val="24"/>
         </w:rPr>
-        <w:t>Integrasi nasional akan semakin kuat bila masyarakat merasa diperlakukan adil. Karena itu, pemerataan pembangunan menjadi bagian penting dari menjaga persatuan. Ketika daerah tertinggal tidak mendapat perhatian, masyarakat setempat dapat merasa ditinggalkan oleh negara, dan perasaan ini bila dibiarkan dapat menumbuhkan ketidakpuasan.</w:t>
+        <w:t>Integrasi nasional kian kukuh apabila masyarakat merasa diperlakukan secara adil. Karena itu, pemerataan pembangunan menjadi bagian penting dari menjaga persatuan. Ketika daerah tertinggal tidak mendapat perhatian, masyarakat setempat dapat merasa ditinggalkan oleh negara, dan perasaan ini bila dibiarkan dapat menumbuhkan ketidakpuasan.</w:t>
       </w:r>
     </w:p>
     <w:p>
@@ -5877,7 +5877,7 @@
           <w:i w:val="0"/>
           <w:sz w:val="24"/>
         </w:rPr>
-        <w:t>Pendidikan memiliki peran besar dalam merawat integrasi nasional. Melalui pendidikan, generasi muda dikenalkan pada sejarah bangsa, nilai Pancasila, dan bahaya perpecahan. Pendidikan juga membantu masyarakat memahami bahwa perbedaan bukan alasan untuk saling menjauh, melainkan kekuatan bila dikelola dengan baik.</w:t>
+        <w:t>Dunia pendidikan mengemban peran besar dalam memelihara integrasi nasional. Lewat jalur pendidikan, kaum muda diperkenalkan dengan sejarah bangsa, nilai Pancasila, serta ancaman perpecahan. Pendidikan juga membantu masyarakat memahami bahwa perbedaan bukan alasan untuk saling menjauh, melainkan kekuatan bila dikelola dengan baik.</w:t>
       </w:r>
     </w:p>
     <w:p>
@@ -5943,7 +5943,7 @@
           <w:i w:val="0"/>
           <w:sz w:val="24"/>
         </w:rPr>
-        <w:t>Integrasi nasional adalah proses menyatukan keberagaman menjadi satu kesatuan bangsa tanpa menghapus perbedaan. Prosesnya didorong oleh rasa senasib, bahasa pemersatu, dan nilai Pancasila, tetapi dihambat oleh ketimpangan, sentimen sempit, dan berita palsu.</w:t>
+        <w:t>Integrasi nasional ialah proses merangkai keberagaman menjadi satu bangsa yang padu tanpa meniadakan perbedaan. Prosesnya didorong oleh rasa senasib, bahasa pemersatu, dan nilai Pancasila, tetapi dihambat oleh ketimpangan, sentimen sempit, dan berita palsu.</w:t>
       </w:r>
     </w:p>
     <w:p>
@@ -6194,7 +6194,7 @@
           <w:i w:val="0"/>
           <w:sz w:val="24"/>
         </w:rPr>
-        <w:t>Pada masa reformasi, UUD 1945 mengalami empat kali amandemen antara tahun 1999 hingga 2002. Amandemen menyentuh penegasan hak asasi manusia, pembatasan masa jabatan presiden, penataan lembaga negara, dan pengaturan pemilihan umum yang lebih demokratis. Penataan peraturan turunannya kemudian diatur melalui Undang-Undang Nomor 12 Tahun 2011 tentang Pembentukan Peraturan Perundang-undangan.</w:t>
+        <w:t>Pada masa reformasi, UUD 1945 mengalami empat kali amandemen antara tahun 1999 hingga 2002. Amandemen menyentuh penegasan hak asasi manusia, pembatasan masa jabatan presiden, penataan lembaga negara, dan pengaturan pemilihan umum yang lebih demokratis. Penataan aturan turunannya selanjutnya ditetapkan lewat Undang-Undang Nomor 12 Tahun 2011.</w:t>
       </w:r>
     </w:p>
     <w:p>
@@ -6544,7 +6544,7 @@
           <w:i w:val="0"/>
           <w:sz w:val="24"/>
         </w:rPr>
-        <w:t>Pembagian ini bukan sekadar urusan tata negara, melainkan wujud pembatasan kekuasaan. Setiap lembaga memiliki kewenangan tersendiri dan saling mengawasi, sehingga kekuasaan tidak berjalan tanpa kendali.</w:t>
+        <w:t>Pemisahan ini bukan semata soal tata negara, tetapi merupakan bentuk pengekangan kekuasaan. Setiap lembaga memiliki kewenangan tersendiri dan saling mengawasi, sehingga kekuasaan tidak berjalan tanpa kendali.</w:t>
       </w:r>
     </w:p>
     <w:p>
@@ -6778,7 +6778,7 @@
           <w:i w:val="0"/>
           <w:sz w:val="24"/>
         </w:rPr>
-        <w:t>Kesadaran berkonstitusi berarti kesediaan untuk memahami, menghormati, dan menjalankan aturan dasar negara. Bagi mahasiswa, kesadaran ini dapat dilatih dari hal sederhana, seperti menaati aturan kampus, menyampaikan pendapat secara santun, dan menyelesaikan perbedaan melalui jalur yang sah.</w:t>
+        <w:t>Kesadaran berkonstitusi mengandung arti kesediaan memahami, menghormati, serta menjalankan aturan dasar negara. Pada lingkup mahasiswa, kesadaran semacam itu diasah lewat tindakan kecil, antara lain mematuhi tata tertib kampus, menyuarakan pandangan dengan sopan, dan menuntaskan perselisihan melalui mekanisme yang sah.</w:t>
       </w:r>
     </w:p>
     <w:p>
@@ -6844,7 +6844,7 @@
           <w:i w:val="0"/>
           <w:sz w:val="24"/>
         </w:rPr>
-        <w:t>Salah satu wujud nyata kehadiran konstitusi adalah perlindungan terhadap warga negara. Konstitusi menjamin bahwa setiap orang berhak memperoleh keadilan, pendidikan, rasa aman, dan kebebasan berpendapat. Jaminan ini membuat warga tidak boleh diperlakukan sewenang-wenang oleh kekuasaan.</w:t>
+        <w:t>Salah satu bukti konkret hadirnya konstitusi adalah adanya perlindungan bagi warga negara. Konstitusi memberi jaminan bahwa tiap orang berhak atas keadilan, pendidikan, rasa aman, serta kemerdekaan menyatakan pendapat. Jaminan tersebut menutup peluang kekuasaan memperlakukan warga secara semena-mena.</w:t>
       </w:r>
     </w:p>
     <w:p>
@@ -6860,7 +6860,7 @@
           <w:i w:val="0"/>
           <w:sz w:val="24"/>
         </w:rPr>
-        <w:t>Namun perlindungan itu hanya berjalan baik bila warga memahami haknya. Banyak orang mengalami ketidakadilan tetapi tidak menyadari bahwa hak mereka dilindungi konstitusi, atau tidak mengetahui cara memperjuangkannya. Karena itu, pemahaman terhadap konstitusi menjadi penting agar warga dapat membela diri melalui jalur yang sah.</w:t>
+        <w:t>Namun perlindungan tersebut baru efektif manakala warga mengerti haknya. Tidak sedikit orang menanggung ketidakadilan tanpa menyadari bahwa konstitusi melindungi hak mereka, atau tanpa mengetahui cara menuntutnya. Atas dasar itu, penguasaan terhadap konstitusi menjadi krusial supaya warga mampu membela diri lewat jalur yang sah.</w:t>
       </w:r>
     </w:p>
     <w:p>
@@ -6876,7 +6876,7 @@
           <w:i w:val="0"/>
           <w:sz w:val="24"/>
         </w:rPr>
-        <w:t>Konstitusi juga melindungi kelompok minoritas dari dominasi mayoritas. Dalam demokrasi, suara terbanyak memang menentukan, tetapi konstitusi memastikan hak kelompok kecil tetap dihormati. Inilah yang menjaga agar demokrasi tidak berubah menjadi penindasan atas nama suara mayoritas.</w:t>
+        <w:t>Konstitusi sekaligus menaungi kelompok minoritas dari dominasi mayoritas. Pada demokrasi, suara mayoritas memang menjadi penentu, namun konstitusi menjamin hak kelompok minoritas tetap dijunjung. Hal inilah yang mencegah demokrasi menjelma menjadi penindasan yang berdalih suara mayoritas.</w:t>
       </w:r>
     </w:p>
     <w:p>
@@ -6942,7 +6942,7 @@
           <w:i w:val="0"/>
           <w:sz w:val="24"/>
         </w:rPr>
-        <w:t>Pembatasan kekuasaan diwujudkan melalui pembagian tugas antarlembaga negara serta mekanisme saling mengawasi. Presiden menjalankan pemerintahan, Dewan Perwakilan Rakyat membuat undang-undang dan mengawasi, sedangkan lembaga peradilan menegakkan keadilan. Tidak ada satu lembaga pun yang boleh menguasai seluruh kekuasaan negara.</w:t>
+        <w:t>Pembatasan kekuasaan diwujudkan melalui pembagian tugas antarlembaga negara serta mekanisme saling mengawasi. Presiden mengendalikan jalannya pemerintahan, Dewan Perwakilan Rakyat menyusun undang-undang sekaligus mengawasi, sementara lembaga peradilan menegakkan keadilan. Tidak ada satu lembaga pun yang boleh menguasai seluruh kekuasaan negara.</w:t>
       </w:r>
     </w:p>
     <w:p>
@@ -6992,7 +6992,7 @@
           <w:i w:val="0"/>
           <w:sz w:val="24"/>
         </w:rPr>
-        <w:t>Konstitusi mengatur hubungan timbal balik antara negara dan warga negara. Negara memiliki kewenangan membuat aturan dan menyelenggarakan pemerintahan, tetapi kewenangan itu dibatasi agar tidak melanggar hak warga. Sebaliknya, warga negara wajib menaati aturan, tetapi juga berhak menuntut pelayanan dan perlindungan.</w:t>
+        <w:t>Konstitusi menata relasi dua arah antara negara dengan warganya. Negara memang berwenang menyusun aturan dan menjalankan pemerintahan, tetapi kewenangan tersebut dipagari supaya tidak menabrak hak warga. Sebaliknya, warga berkewajiban mematuhi aturan, namun pada saat yang sama berhak menuntut pelayanan serta perlindungan.</w:t>
       </w:r>
     </w:p>
     <w:p>
@@ -7008,7 +7008,7 @@
           <w:i w:val="0"/>
           <w:sz w:val="24"/>
         </w:rPr>
-        <w:t>Hubungan ini idealnya berjalan saling menghormati. Negara hadir untuk melayani, sedangkan warga berpartisipasi secara bertanggung jawab. Ketika keduanya menjalankan perannya dengan baik, kehidupan bernegara berjalan tertib dan kepercayaan publik terhadap pemerintah pun terjaga.</w:t>
+        <w:t>Hubungan ini idealnya berjalan saling menghormati. Negara berada untuk melayani, sementara warga turut serta secara bertanggung jawab. Tatkala kedua pihak menunaikan perannya secara baik, roda kehidupan bernegara berputar tertib dan kepercayaan rakyat kepada pemerintah ikut terpelihara.</w:t>
       </w:r>
     </w:p>
     <w:p>
@@ -7277,7 +7277,7 @@
           <w:i w:val="0"/>
           <w:sz w:val="24"/>
         </w:rPr>
-        <w:t>Berbeda dari hak warga negara yang diperoleh karena status kewarganegaraan, hak asasi bersifat universal dan tidak dapat dicabut oleh negara mana pun. Indonesia mengakui dan melindungi hak asasi melalui UUD NRI Tahun 1945 dan Undang-Undang Nomor 39 Tahun 1999 tentang Hak Asasi Manusia, serta membentuk Komisi Nasional Hak Asasi Manusia sebagai lembaga pengawas.</w:t>
+        <w:t>Berbeda dari hak warga negara yang diperoleh karena status kewarganegaraan, hak asasi bersifat universal dan tidak dapat dicabut oleh negara mana pun. Perlindungan hak asasi di Indonesia ditopang UUD NRI Tahun 1945 beserta Undang-Undang Nomor 39 Tahun 1999, dengan Komisi Nasional Hak Asasi Manusia sebagai pemantaunya.</w:t>
       </w:r>
     </w:p>
     <w:p>
@@ -7827,7 +7827,7 @@
           <w:i w:val="0"/>
           <w:sz w:val="24"/>
         </w:rPr>
-        <w:t>Di tingkat nasional, instrumen hak asasi mencakup UUD NRI Tahun 1945 dan Undang-Undang Nomor 39 Tahun 1999 tentang Hak Asasi Manusia, serta keberadaan Komisi Nasional Hak Asasi Manusia. Keselarasan antara instrumen nasional dan internasional menunjukkan bahwa isu kemanusiaan telah menjadi perhatian bersama, bukan hanya kepentingan satu negara.</w:t>
+        <w:t>Di lingkup dalam negeri, perangkat hak asasi bertumpu pada UUD NRI Tahun 1945, ditambah Undang-Undang Nomor 39 Tahun 1999 serta kehadiran Komisi Nasional Hak Asasi Manusia. Keselarasan antara instrumen nasional dan internasional menunjukkan bahwa isu kemanusiaan telah menjadi perhatian bersama, bukan hanya kepentingan satu negara.</w:t>
       </w:r>
     </w:p>
     <w:p>
@@ -8059,7 +8059,7 @@
           <w:i w:val="0"/>
           <w:sz w:val="24"/>
         </w:rPr>
-        <w:t>Dalam kehidupan demokrasi, hak dan kewajiban harus berjalan seimbang. Demokrasi memberi ruang bagi warga negara untuk menyampaikan pendapat, memilih pemimpin, dan mengawasi pemerintahan. Namun, hak-hak itu menuntut kedewasaan agar tidak berubah menjadi kebebasan tanpa batas yang justru merugikan orang lain.</w:t>
+        <w:t>Dalam kehidupan demokrasi, hak dan kewajiban harus berjalan seimbang. Demokrasi membuka ruang bagi warga untuk menyuarakan pendapat, menentukan pemimpin, serta mengawasi jalannya pemerintahan. Namun, hak-hak itu menuntut kedewasaan agar tidak berubah menjadi kebebasan tanpa batas yang justru merugikan orang lain.</w:t>
       </w:r>
     </w:p>
     <w:p>
@@ -8075,7 +8075,7 @@
           <w:i w:val="0"/>
           <w:sz w:val="24"/>
         </w:rPr>
-        <w:t>Dalam pemilihan umum, misalnya, warga negara memiliki hak memilih, tetapi juga berkewajiban menggunakan hak itu secara bertanggung jawab, tidak menjual suara, dan tidak mudah terprovokasi. Keseimbangan inilah yang membuat demokrasi berjalan sehat, bukan sekadar ajang perebutan suara.</w:t>
+        <w:t>Pada pemilihan umum, sebagai contoh, warga memang berhak memberikan suara, namun sekaligus wajib memakai hak itu secara bertanggung jawab, tidak memperjualbelikan suara, dan tidak gampang terhasut. Keseimbangan inilah yang membuat demokrasi berjalan sehat, bukan sekadar ajang perebutan suara.</w:t>
       </w:r>
     </w:p>
     <w:p>
@@ -8125,7 +8125,7 @@
           <w:i w:val="0"/>
           <w:sz w:val="24"/>
         </w:rPr>
-        <w:t>Selain hak dan kewajiban yang diatur hukum, warga negara juga memiliki tanggung jawab sosial. Tanggung jawab ini tampak dari kepedulian terhadap lingkungan, kesediaan membantu sesama, dan keterlibatan dalam kegiatan masyarakat. Tanggung jawab sosial memperkuat hubungan antarwarga dan menjaga semangat gotong royong.</w:t>
+        <w:t>Di luar hak dan kewajiban yang ditetapkan hukum, warga negara turut memikul tanggung jawab sosial. Tanggung jawab tersebut terbaca pada kepedulian terhadap lingkungan, keikhlasan membantu sesama, serta keterlibatan dalam aktivitas kemasyarakatan. Tanggung jawab sosial mengeratkan jalinan antarwarga dan merawat semangat gotong royong.</w:t>
       </w:r>
     </w:p>
     <w:p>
@@ -8141,7 +8141,7 @@
           <w:i w:val="0"/>
           <w:sz w:val="24"/>
         </w:rPr>
-        <w:t>Jika setiap orang hanya memikirkan diri sendiri, kehidupan bersama akan melemah. Sebaliknya, ketika warga saling peduli, nilai kebersamaan tetap hidup. Tanggung jawab sosial inilah yang membuat hak dan kewajiban tidak berhenti pada urusan hukum, tetapi juga menyentuh kualitas kehidupan bermasyarakat.</w:t>
+        <w:t>Andai tiap orang cuma mementingkan dirinya, kehidupan bersama akan rapuh. Sebaliknya, manakala warga saling memperhatikan, nilai kebersamaan akan tetap menyala. Tanggung jawab sosial inilah yang membuat hak dan kewajiban tidak berhenti pada urusan hukum, tetapi juga menyentuh kualitas kehidupan bermasyarakat.</w:t>
       </w:r>
     </w:p>
     <w:p>
@@ -8157,7 +8157,7 @@
           <w:i w:val="0"/>
           <w:sz w:val="24"/>
         </w:rPr>
-        <w:t>Mahasiswa dapat mewujudkan tanggung jawab sosial melalui kegiatan pengabdian, aksi sosial, dan kepedulian terhadap persoalan di sekitarnya. Bagi calon konselor, kepedulian sosial ini menjadi modal penting dalam memahami dan membantu individu yang menghadapi kesulitan.</w:t>
+        <w:t>Mahasiswa bisa menunaikan tanggung jawab sosial lewat kegiatan pengabdian, gerakan sosial, serta kepedulian pada persoalan di sekelilingnya. Bagi calon konselor, kepedulian sosial ini menjadi modal penting dalam memahami dan membantu individu yang menghadapi kesulitan.</w:t>
       </w:r>
     </w:p>
     <w:p>
@@ -8191,7 +8191,7 @@
           <w:i w:val="0"/>
           <w:sz w:val="24"/>
         </w:rPr>
-        <w:t>Hak dan kewajiban warga negara berjalan seiring dalam kerangka tanggung jawab. Hak asasi manusia memiliki cakupan universal yang melekat pada setiap manusia, dijamin oleh UUD NRI Tahun 1945 dan Undang-Undang Nomor 39 Tahun 1999.</w:t>
+        <w:t>Hak dan kewajiban warga negara berjalan seiring dalam kerangka tanggung jawab. Hak asasi manusia bersifat universal dan melekat pada tiap insan, dengan jaminan yang tertuang dalam UUD NRI Tahun 1945 serta Undang-Undang Nomor 39 Tahun 1999.</w:t>
       </w:r>
     </w:p>
     <w:p>
@@ -8360,7 +8360,7 @@
           <w:i w:val="0"/>
           <w:sz w:val="24"/>
         </w:rPr>
-        <w:t>Negara hukum berpijak pada sejumlah prinsip yang memastikan hukum benar-benar menjaga keadilan. Prinsip persamaan di hadapan hukum menegaskan bahwa semua orang memiliki kedudukan yang sama tanpa memandang status. Prinsip perlindungan hak menuntut negara menjamin hak dasar warga. Prinsip pembatasan kekuasaan mencegah kekuasaan terpusat melalui mekanisme saling mengawasi.</w:t>
+        <w:t>Negara hukum berpijak pada sejumlah prinsip yang memastikan hukum benar-benar menjaga keadilan. Asas kesetaraan di mata hukum menegaskan bahwa tiap orang berkedudukan sama tanpa memandang status. Prinsip perlindungan hak menuntut negara menjamin hak dasar warga. Prinsip pembatasan kekuasaan mencegah kekuasaan terpusat melalui mekanisme saling mengawasi.</w:t>
       </w:r>
     </w:p>
     <w:p>
@@ -8768,7 +8768,7 @@
           <w:i w:val="0"/>
           <w:sz w:val="24"/>
         </w:rPr>
-        <w:t>Supremasi hukum menyatakan bahwa hukum berada di posisi tertinggi dalam kehidupan bernegara. Tidak ada kekuasaan atau golongan yang boleh berada di atas hukum. Ketika hukum ditegakkan tanpa pandang bulu, masyarakat merasa aman dan percaya pada negara. Sebaliknya, hukum yang tajam ke bawah tetapi tumpul ke atas akan mengikis kepercayaan publik.</w:t>
+        <w:t>Supremasi hukum menyatakan bahwa hukum berada di posisi tertinggi dalam kehidupan bernegara. Tidak ada kekuasaan atau golongan yang boleh berada di atas hukum. Ketika hukum ditegakkan tanpa pandang bulu, masyarakat merasa aman dan percaya pada negara. Sebaliknya, hukum yang galak kepada rakyat kecil namun lembek kepada penguasa akan menggerus kepercayaan publik.</w:t>
       </w:r>
     </w:p>
     <w:p>
@@ -9084,7 +9084,7 @@
           <w:i w:val="0"/>
           <w:sz w:val="24"/>
         </w:rPr>
-        <w:t>Penegakan hukum yang adil membutuhkan lembaga peradilan yang independen. Hakim harus bebas dari tekanan politik, ekonomi, maupun kepentingan pribadi agar putusan yang dihasilkan benar-benar berdasarkan fakta dan hukum. Tanpa independensi, masyarakat akan kehilangan tempat untuk mencari keadilan.</w:t>
+        <w:t>Penegakan hukum yang adil membutuhkan lembaga peradilan yang independen. Hakim wajib lepas dari tekanan politik, ekonomi, maupun pamrih pribadi supaya putusannya sungguh berpijak pada fakta dan hukum. Tanpa independensi, masyarakat akan kehilangan tempat untuk mencari keadilan.</w:t>
       </w:r>
     </w:p>
     <w:p>
@@ -9198,7 +9198,7 @@
           <w:i w:val="0"/>
           <w:sz w:val="24"/>
         </w:rPr>
-        <w:t>Bagi mahasiswa, memahami prinsip ini membantu menumbuhkan sikap kritis yang sehat terhadap praktik hukum. Ketika ada proses hukum yang dinilai tidak adil, mahasiswa dapat menyoroti melalui cara yang sah dan berbasis data, bukan dengan hasutan yang justru merusak proses peradilan.</w:t>
+        <w:t>Bagi mahasiswa, menguasai asas ini menolong tumbuhnya sikap kritis yang sehat terhadap praktik hukum. Ketika ada proses hukum yang dinilai tidak adil, mahasiswa dapat menyoroti melalui cara yang sah dan berbasis data, bukan dengan hasutan yang justru merusak proses peradilan.</w:t>
       </w:r>
     </w:p>
     <w:p>
@@ -9232,7 +9232,7 @@
           <w:i w:val="0"/>
           <w:sz w:val="24"/>
         </w:rPr>
-        <w:t>Kepercayaan publik terhadap hukum adalah modal berharga yang mudah rusak. Sekali masyarakat merasa hukum tidak adil, kepercayaan itu sulit dipulihkan. Padahal tanpa kepercayaan, masyarakat cenderung mengambil jalan sendiri yang justru menambah persoalan.</w:t>
+        <w:t>Kepercayaan publik terhadap hukum adalah modal berharga yang mudah rusak. Begitu masyarakat menilai hukum tidak adil, kepercayaan itu payah untuk dipulihkan. Padahal bila kepercayaan hilang, masyarakat condong menempuh jalannya sendiri yang malah memperbanyak persoalan.</w:t>
       </w:r>
     </w:p>
     <w:p>
@@ -9248,7 +9248,7 @@
           <w:i w:val="0"/>
           <w:sz w:val="24"/>
         </w:rPr>
-        <w:t>Membangun kepercayaan menuntut bukti, bukan sekadar janji. Penegakan hukum yang konsisten, transparan, dan tidak pandang bulu adalah cara paling nyata untuk memulihkannya. Ketika masyarakat melihat bahwa pihak yang bersalah pun diproses secara adil, kepercayaan akan tumbuh dengan sendirinya.</w:t>
+        <w:t>Membangun kepercayaan menuntut bukti, bukan sekadar janji. Penegakan hukum yang ajeg, terbuka, serta tidak tebang pilih merupakan jalan paling konkret untuk memulihkannya. Manakala masyarakat menyaksikan pihak bersalah turut diproses secara adil, kepercayaan pun akan bersemi dengan sendirinya.</w:t>
       </w:r>
     </w:p>
     <w:p>
@@ -9401,7 +9401,7 @@
           <w:i w:val="0"/>
           <w:sz w:val="24"/>
         </w:rPr>
-        <w:t>Wawasan nusantara adalah cara pandang bangsa Indonesia terhadap diri dan lingkungannya berdasarkan Pancasila dan UUD NRI Tahun 1945, dengan mengutamakan persatuan dan kesatuan wilayah. Sebagai negara kepulauan terbesar di dunia, Indonesia memiliki tantangan geografis yang unik, dengan ribuan pulau dan keragaman budaya yang menjadi kekayaan sekaligus tantangan.</w:t>
+        <w:t>Wawasan nusantara merupakan cara bangsa Indonesia memaknai diri serta lingkungannya yang berlandas Pancasila dan UUD NRI Tahun 1945, seraya menomorsatukan keutuhan wilayah. Sebagai negara kepulauan terbesar di dunia, Indonesia memiliki tantangan geografis yang unik, dengan ribuan pulau dan keragaman budaya yang menjadi kekayaan sekaligus tantangan.</w:t>
       </w:r>
     </w:p>
     <w:p>
@@ -9517,7 +9517,7 @@
           <w:i w:val="0"/>
           <w:sz w:val="24"/>
         </w:rPr>
-        <w:t>Geostrategi adalah strategi nasional yang disusun berdasarkan kondisi geografis dan berbagai aspek kehidupan bangsa untuk mencapai tujuan nasional. Salah satu wujudnya adalah ketahanan nasional, yaitu kemampuan bangsa menjaga keberlangsungan hidup, persatuan, dan stabilitas dalam menghadapi tantangan dari dalam maupun luar. Landasan pertahanannya antara lain diatur dalam Undang-Undang Nomor 3 Tahun 2002 tentang Pertahanan Negara.</w:t>
+        <w:t>Geostrategi adalah strategi nasional yang disusun berdasarkan kondisi geografis dan berbagai aspek kehidupan bangsa untuk mencapai tujuan nasional. Salah satu wujudnya adalah ketahanan nasional, yaitu kemampuan bangsa menjaga keberlangsungan hidup, persatuan, dan stabilitas dalam menghadapi tantangan dari dalam maupun luar. Pijakan pertahanannya, salah satunya, diatur lewat Undang-Undang Nomor 3 Tahun 2002.</w:t>
       </w:r>
     </w:p>
     <w:p>
@@ -9975,7 +9975,7 @@
           <w:i w:val="0"/>
           <w:sz w:val="24"/>
         </w:rPr>
-        <w:t>Sebagai negara kepulauan, sebagian besar wilayah Indonesia adalah laut. Karena itu, kesadaran maritim menjadi bagian penting dari wawasan nusantara. Laut bukan sekadar pemisah, melainkan penghubung yang menyatukan kehidupan bangsa, sekaligus sumber pangan, energi, dan jalur perdagangan yang harus dijaga.</w:t>
+        <w:t>Selaku negara kepulauan, mayoritas wilayah Indonesia berupa lautan. Dengan alasan itu, kesadaran kemaritiman menjelma bagian penting dari wawasan nusantara. Laut bukan sekadar pemisah, melainkan penghubung yang menyatukan kehidupan bangsa, sekaligus sumber pangan, energi, dan jalur perdagangan yang harus dijaga.</w:t>
       </w:r>
     </w:p>
     <w:p>
@@ -10157,7 +10157,7 @@
           <w:i w:val="0"/>
           <w:sz w:val="24"/>
         </w:rPr>
-        <w:t>Daerah perbatasan, pulau kecil, dan wilayah terpencil perlu mendapat perhatian agar masyarakat di sana juga merasakan manfaat pembangunan. Ketika seluruh wilayah merasa diperhatikan, rasa memiliki terhadap bangsa akan tumbuh lebih kuat, dan persatuan nasional menjadi lebih kokoh.</w:t>
+        <w:t>Daerah perbatasan, pulau kecil, dan wilayah terpencil perlu mendapat perhatian agar masyarakat di sana juga merasakan manfaat pembangunan. Tatkala segenap daerah merasa diperhatikan, rasa memiliki terhadap bangsa akan menguat, dan persatuan nasional pun bertambah kokoh.</w:t>
       </w:r>
     </w:p>
     <w:p>
@@ -10173,7 +10173,7 @@
           <w:i w:val="0"/>
           <w:sz w:val="24"/>
         </w:rPr>
-        <w:t>Pembangunan yang merata juga memperkuat ketahanan nasional. Masyarakat yang sejahtera dan merasa diperlakukan adil cenderung lebih tahan terhadap provokasi yang ingin memecah belah. Dengan demikian, pemerataan pembangunan bukan sekadar urusan ekonomi, melainkan bagian dari menjaga keutuhan bangsa.</w:t>
+        <w:t>Pembangunan yang merata juga memperkuat ketahanan nasional. Masyarakat yang sejahtera dan merasa diperlakukan adil cenderung lebih tahan terhadap provokasi yang ingin memecah belah. Dengan begitu, pemerataan pembangunan bukan semata perkara ekonomi, melainkan bagian dari merawat keutuhan bangsa.</w:t>
       </w:r>
     </w:p>
     <w:p>
@@ -10223,7 +10223,7 @@
           <w:i w:val="0"/>
           <w:sz w:val="24"/>
         </w:rPr>
-        <w:t>Ketahanan nasional sangat dipengaruhi oleh ketahanan ekonomi. Negara dengan ekonomi yang rapuh mudah tertekan oleh krisis dan ketergantungan pada pihak luar. Karena itu, kemandirian ekonomi yang dibangun melalui penguatan usaha kecil, peningkatan kualitas sumber daya manusia, dan pengelolaan kekayaan alam yang adil menjadi bagian penting dari geostrategi.</w:t>
+        <w:t>Ketahanan nasional sangat dipengaruhi oleh ketahanan ekonomi. Negara yang fondasi ekonominya rapuh gampang tergoncang oleh krisis serta ketergantungan kepada pihak asing. Karena itu, kemandirian ekonomi yang dibangun melalui penguatan usaha kecil, peningkatan kualitas sumber daya manusia, dan pengelolaan kekayaan alam yang adil menjadi bagian penting dari geostrategi.</w:t>
       </w:r>
     </w:p>
     <w:p>
@@ -10239,7 +10239,7 @@
           <w:i w:val="0"/>
           <w:sz w:val="24"/>
         </w:rPr>
-        <w:t>Selain ekonomi, ketahanan sosial budaya juga tidak boleh diabaikan. Kemampuan masyarakat mempertahankan nilai, tradisi, dan jati diri di tengah perubahan zaman menjadi benteng dari dalam. Sikap selektif terhadap budaya luar, tanpa menutup diri dari kemajuan, menjadi kunci agar bangsa tetap maju tanpa kehilangan identitas.</w:t>
+        <w:t>Di luar ekonomi, ketahanan sosial budaya pun tak boleh disepelekan. Kesanggupan masyarakat menjaga nilai, tradisi, serta jati diri di tengah pergeseran zaman berfungsi sebagai benteng dari dalam. Kemampuan memilah budaya asing, tanpa menolak kemajuan, menjadi syarat agar bangsa terus berkembang tanpa kehilangan jati dirinya.</w:t>
       </w:r>
     </w:p>
     <w:p>
@@ -10355,7 +10355,7 @@
           <w:i w:val="0"/>
           <w:sz w:val="24"/>
         </w:rPr>
-        <w:t>Wawasan nusantara adalah cara pandang yang menempatkan seluruh wilayah Indonesia sebagai satu kesatuan, sekaligus menjadi geopolitik Indonesia. Geostrategi diwujudkan melalui ketahanan nasional yang mencakup dimensi ideologi, politik, ekonomi, sosial budaya, serta pertahanan dan keamanan.</w:t>
+        <w:t>Wawasan nusantara adalah cara pandang yang menempatkan seluruh wilayah Indonesia sebagai satu kesatuan, sekaligus menjadi geopolitik Indonesia. Geostrategi dijelmakan lewat ketahanan nasional yang merangkum dimensi ideologi, politik, ekonomi, sosial budaya, di samping pertahanan dan keamanan.</w:t>
       </w:r>
     </w:p>
     <w:p>
@@ -10458,7 +10458,7 @@
           <w:i w:val="0"/>
           <w:sz w:val="24"/>
         </w:rPr>
-        <w:t>Korupsi adalah penyalahgunaan kekuasaan, jabatan, atau kepercayaan untuk memperoleh keuntungan pribadi atau kelompok yang merugikan kepentingan umum. Korupsi tidak selalu berbentuk pencurian uang secara langsung. Suap, gratifikasi, penggelapan, penyalahgunaan wewenang, dan penggelembungan anggaran termasuk dalam wujud korupsi.</w:t>
+        <w:t>Korupsi merupakan penyelewengan kuasa, kedudukan, atau amanah guna meraup keuntungan pribadi maupun kelompok yang berakibat merugikan kepentingan orang banyak. Korupsi tidak selalu berbentuk pencurian uang secara langsung. Suap, gratifikasi, penggelapan, penyalahgunaan wewenang, dan penggelembungan anggaran termasuk dalam wujud korupsi.</w:t>
       </w:r>
     </w:p>
     <w:p>
@@ -10778,7 +10778,7 @@
           <w:i w:val="0"/>
           <w:sz w:val="24"/>
         </w:rPr>
-        <w:t>Korupsi hadir dalam beragam bentuk, mulai dari suap untuk memuluskan urusan, gratifikasi yang menyamar sebagai hadiah, hingga pemerasan oleh pihak yang memiliki kewenangan. Mengenali berbagai bentuk ini penting agar masyarakat tidak menganggap praktik tertentu sebagai hal yang wajar, misalnya memberi uang pelicin untuk mempercepat layanan.</w:t>
+        <w:t>Korupsi muncul dalam aneka rupa, terbentang dari suap untuk melancarkan urusan, gratifikasi yang berkedok hadiah, sampai pemerasan oleh pihak yang memegang wewenang. Mengenali berbagai bentuk ini penting agar masyarakat tidak menganggap praktik tertentu sebagai hal yang wajar, misalnya memberi uang pelicin untuk mempercepat layanan.</w:t>
       </w:r>
     </w:p>
     <w:p>
@@ -10794,7 +10794,7 @@
           <w:i w:val="0"/>
           <w:sz w:val="24"/>
         </w:rPr>
-        <w:t>Dampak korupsi terasa pada banyak sisi. Secara ekonomi, anggaran yang seharusnya untuk pendidikan dan kesehatan justru mengalir ke pihak tertentu. Secara sosial, korupsi memperlebar ketimpangan dan menurunkan kepercayaan terhadap negara. Secara moral, korupsi menumbuhkan budaya permisif terhadap ketidakjujuran. Rakyat kecil sering kali menjadi pihak yang paling dirugikan.</w:t>
+        <w:t>Dampak korupsi terasa pada banyak sisi. Di bidang ekonomi, dana yang mestinya menopang pendidikan dan kesehatan malah berbelok ke segelintir pihak. Secara sosial, korupsi memperlebar ketimpangan dan menurunkan kepercayaan terhadap negara. Secara moral, korupsi menumbuhkan budaya permisif terhadap ketidakjujuran. Rakyat kecil sering kali menjadi pihak yang paling dirugikan.</w:t>
       </w:r>
     </w:p>
     <w:p>
@@ -11152,7 +11152,7 @@
           <w:i w:val="0"/>
           <w:sz w:val="24"/>
         </w:rPr>
-        <w:t>Nilai-nilai ini tampak sederhana, tetapi justru di situlah pendidikan antikorupsi diuji. Gaya hidup berlebihan dan keinginan kaya secara instan sering menjadi pintu masuk perilaku koruptif, sehingga penanaman nilai sejak masa kuliah menjadi sangat penting.</w:t>
+        <w:t>Nilai-nilai ini tampak sederhana, tetapi justru di situlah pendidikan antikorupsi diuji. Pola hidup mewah dan hasrat kaya secara kilat kerap membuka celah perilaku koruptif, sehingga penyemaian nilai sejak bangku kuliah terasa sangat mendesak.</w:t>
       </w:r>
     </w:p>
     <w:p>
@@ -11186,7 +11186,7 @@
           <w:i w:val="0"/>
           <w:sz w:val="24"/>
         </w:rPr>
-        <w:t>Korupsi sering dibayangkan sebagai kejahatan pejabat besar, padahal benihnya muncul dalam keseharian. Menyontek, menitipkan tanda tangan kehadiran, atau memanipulasi laporan kegiatan adalah contoh kecil yang mencerminkan sikap tidak jujur. Bila dianggap sepele, kebiasaan ini dapat berkembang menjadi penyimpangan yang lebih besar ketika seseorang memegang wewenang.</w:t>
+        <w:t>Korupsi lazim dibayangkan sebagai ulah pejabat tinggi, padahal bibitnya bersemi dalam keseharian. Menyontek, menitip tanda tangan kehadiran, atau memanipulasi laporan kegiatan tergolong contoh kecil yang mencerminkan ketidakjujuran. Bila dianggap sepele, kebiasaan ini dapat berkembang menjadi penyimpangan yang lebih besar ketika seseorang memegang wewenang.</w:t>
       </w:r>
     </w:p>
     <w:p>
@@ -11202,7 +11202,7 @@
           <w:i w:val="0"/>
           <w:sz w:val="24"/>
         </w:rPr>
-        <w:t>Karena itu, pendidikan antikorupsi harus menyentuh perilaku sehari-hari, bukan hanya membahas kasus besar yang terasa jauh. Kesadaran untuk jujur dalam hal kecil adalah latihan paling nyata dalam membangun integritas.</w:t>
+        <w:t>Maka dari itu, pendidikan antikorupsi mesti menjangkau perilaku keseharian, bukan semata mengupas kasus kakap yang terasa berjarak. Kesadaran untuk jujur dalam hal kecil adalah latihan paling nyata dalam membangun integritas.</w:t>
       </w:r>
     </w:p>
     <w:p>
@@ -11236,7 +11236,7 @@
           <w:i w:val="0"/>
           <w:sz w:val="24"/>
         </w:rPr>
-        <w:t>Perguruan tinggi memikul tanggung jawab menanamkan nilai antikorupsi, tidak hanya melalui materi kuliah, tetapi juga melalui budaya dan tata kelola kampus. Kampus yang membiarkan plagiarisme atau kecurangan organisasi sebenarnya sedang menormalkan benih korupsi, sedangkan kampus yang tegas terhadap ketidakjujuran sedang menanam fondasi integritas.</w:t>
+        <w:t>Perguruan tinggi memikul tanggung jawab menanamkan nilai antikorupsi, tidak hanya melalui materi kuliah, tetapi juga melalui budaya dan tata kelola kampus. Kampus yang membiarkan penjiplakan atau kecurangan organisasi sejatinya tengah melumrahkan bibit korupsi, sedangkan kampus yang tegas terhadap ketidakjujuran tengah menanam pondasi integritas.</w:t>
       </w:r>
     </w:p>
     <w:p>
@@ -11336,7 +11336,7 @@
           <w:i w:val="0"/>
           <w:sz w:val="24"/>
         </w:rPr>
-        <w:t>Pencegahan korupsi menuntut pendekatan yang menyeluruh, bukan hanya penindakan. Dari sisi sistem, diperlukan transparansi anggaran, pelayanan publik yang sederhana, dan pengawasan yang ketat agar peluang penyimpangan dipersempit. Dari sisi manusia, diperlukan penanaman nilai integritas sejak dini melalui pendidikan dan keteladanan.</w:t>
+        <w:t>Pencegahan korupsi menuntut pendekatan yang menyeluruh, bukan hanya penindakan. Ditinjau dari sistem, diperlukan keterbukaan anggaran, pelayanan publik yang ringkas, serta pengawasan yang ketat supaya ruang penyimpangan menyempit. Ditinjau dari sisi pelaku, dibutuhkan penyemaian nilai integritas sejak dini lewat pendidikan dan keteladanan.</w:t>
       </w:r>
     </w:p>
     <w:p>
@@ -11352,7 +11352,7 @@
           <w:i w:val="0"/>
           <w:sz w:val="24"/>
         </w:rPr>
-        <w:t>Keduanya harus berjalan bersama. Sistem yang baik tanpa manusia yang jujur akan mudah disiasati, sedangkan manusia yang jujur tanpa sistem yang baik akan kesulitan bertahan. Karena itu, pemberantasan korupsi yang berhasil selalu menggabungkan perbaikan tata kelola dengan pembentukan karakter.</w:t>
+        <w:t>Keduanya harus berjalan bersama. Tata kelola yang rapi tetap rentan diakali apabila pelakunya tidak jujur, sementara pribadi jujur akan kewalahan jika berada dalam tata kelola yang buruk. Oleh karena itu, pemberantasan korupsi yang berhasil senantiasa memadukan pembenahan tata kelola dengan penempaan karakter.</w:t>
       </w:r>
     </w:p>
     <w:p>
@@ -11386,7 +11386,7 @@
           <w:i w:val="0"/>
           <w:sz w:val="24"/>
         </w:rPr>
-        <w:t>Budaya integritas berarti kesesuaian antara perkataan dan perbuatan, serta keberanian untuk tetap jujur meski ada kesempatan untuk curang. Budaya ini tidak terbentuk seketika, melainkan melalui kebiasaan yang dilatih setiap hari. Di lingkungan kampus, ia dimulai dari hal kecil seperti tidak menyontek, tidak memalsukan tanda tangan, dan mengelola organisasi secara transparan.</w:t>
+        <w:t>Budaya integritas mengandung makna keselarasan antara ucapan dan tindakan, sekaligus nyali untuk tetap jujur kendati peluang berbuat curang tersedia. Budaya semacam ini tidak lahir seketika, tetapi tumbuh lewat kebiasaan yang ditempa saban hari. Pada lingkungan kampus, hal itu berawal dari perkara kecil semisal menjauhi sontek-menyontek, tidak memalsu tanda tangan, serta mengurus organisasi secara terbuka.</w:t>
       </w:r>
     </w:p>
     <w:p>
@@ -11402,7 +11402,7 @@
           <w:i w:val="0"/>
           <w:sz w:val="24"/>
         </w:rPr>
-        <w:t>Organisasi kemahasiswaan yang dikelola dengan jujur dan akuntabel menjadi latihan kecil bagi pembentukan karakter pemimpin masa depan. Selain itu, empati terhadap korban korupsi perlu ditumbuhkan, karena banyak masyarakat kecil dirugikan akibat pembangunan yang gagal atau pelayanan publik yang buruk. Dengan kesadaran ini, penolakan terhadap korupsi lahir dari pemahaman, bukan sekadar kewajiban menaati aturan.</w:t>
+        <w:t>Organisasi kemahasiswaan yang dijalankan secara jujur dan akuntabel berfungsi sebagai gladi kecil bagi penempaan karakter pemimpin masa depan. Di samping itu, empati kepada korban korupsi perlu dipupuk, sebab banyak rakyat kecil terimbas akibat pembangunan yang mangkrak atau layanan publik yang buruk. Dengan kesadaran ini, penolakan terhadap korupsi lahir dari pemahaman, bukan sekadar kewajiban menaati aturan.</w:t>
       </w:r>
     </w:p>
     <w:p>
@@ -11436,7 +11436,7 @@
           <w:i w:val="0"/>
           <w:sz w:val="24"/>
         </w:rPr>
-        <w:t>Pemberantasan korupsi di Indonesia melibatkan beberapa lembaga, seperti Komisi Pemberantasan Korupsi, Kepolisian, Kejaksaan, dan pengadilan. Komisi Pemberantasan Korupsi memiliki peran khusus karena berfokus pada pencegahan sekaligus penindakan, terutama untuk perkara yang melibatkan kerugian negara dan pejabat publik.</w:t>
+        <w:t>Upaya memberantas korupsi di Indonesia menggandeng sejumlah lembaga, di antaranya Komisi Pemberantasan Korupsi, Kepolisian, Kejaksaan, serta pengadilan. Komisi Pemberantasan Korupsi mengemban peran khas sebab menggarap pencegahan dan penindakan sekaligus, terutama pada perkara yang menyangkut kerugian negara dan pejabat publik.</w:t>
       </w:r>
     </w:p>
     <w:p>
@@ -11452,7 +11452,7 @@
           <w:i w:val="0"/>
           <w:sz w:val="24"/>
         </w:rPr>
-        <w:t>Namun, pemberantasan korupsi tidak bisa dibebankan hanya kepada aparat. Korupsi adalah persoalan sistemik yang menuntut perbaikan tata kelola pemerintahan, transparansi anggaran, dan partisipasi masyarakat. Keberhasilannya bergantung pada kerja sama antara negara, masyarakat, media, dunia pendidikan, dan sektor swasta.</w:t>
+        <w:t>Akan tetapi, beban pemberantasan korupsi tidak bisa ditimpakan semata kepada aparat. Korupsi tergolong masalah sistemik yang menuntut pembenahan tata kelola pemerintahan, keterbukaan anggaran, serta keterlibatan masyarakat. Keberhasilannya ditentukan oleh sinergi antara negara, masyarakat, media, dunia pendidikan, serta dunia usaha.</w:t>
       </w:r>
     </w:p>
     <w:p>
@@ -11468,7 +11468,7 @@
           <w:i w:val="0"/>
           <w:sz w:val="24"/>
         </w:rPr>
-        <w:t>Setiap warga negara memiliki tanggung jawab untuk menolak dan tidak ikut dalam praktik koruptif. Tanggung jawab ini dapat diwujudkan melalui tindakan sederhana, seperti menolak memberi uang pelicin, melaporkan penyimpangan, dan memilih pemimpin yang berintegritas. Mahasiswa, sebagai calon pemimpin masa depan, perlu membangun keberanian moral untuk melawan korupsi sejak sekarang.</w:t>
+        <w:t>Tiap warga negara mengemban tanggung jawab untuk menampik dan tidak turut serta dalam praktik koruptif. Tanggung jawab semacam itu dapat diejawantahkan lewat langkah sederhana, antara lain menampik pemberian uang pelicin, mengadukan penyimpangan, serta memilih pemimpin yang berintegritas. Mahasiswa, yang merupakan bakal pemimpin masa depan, perlu menempa keberanian moral untuk menentang korupsi mulai saat ini.</w:t>
       </w:r>
     </w:p>
     <w:p>
@@ -11518,7 +11518,7 @@
           <w:i w:val="0"/>
           <w:sz w:val="24"/>
         </w:rPr>
-        <w:t>Budaya akademik yang bersih sangat penting. Bila kampus membiarkan plagiarisme, jual beli nilai, atau penyalahgunaan jabatan organisasi, kampus justru sedang menormalkan benih korupsi. Sebaliknya, kampus yang tegas terhadap ketidakjujuran sedang menanam fondasi integritas yang kuat bagi mahasiswanya.</w:t>
+        <w:t>Budaya akademik yang bersih sangat penting. Apabila kampus memaklumi penjiplakan, jual beli nilai, atau penyalahgunaan jabatan organisasi, ia sebenarnya tengah melumrahkan bibit korupsi. Sebaliknya, kampus yang tegas menindak ketidakjujuran sejatinya tengah meletakkan pondasi integritas yang kokoh bagi mahasiswanya.</w:t>
       </w:r>
     </w:p>
     <w:p>
@@ -11534,7 +11534,7 @@
           <w:i w:val="0"/>
           <w:sz w:val="24"/>
         </w:rPr>
-        <w:t>Karena itu, pendidikan antikorupsi di perguruan tinggi harus bersifat menyeluruh. Ia tidak cukup berupa materi kuliah, tetapi juga harus tercermin dalam sistem, aturan, dan budaya kampus itu sendiri. Konsistensi antara apa yang diajarkan dan apa yang dipraktikkan menjadi kunci keberhasilannya.</w:t>
+        <w:t>Atas alasan itu, pendidikan antikorupsi di perguruan tinggi mesti dijalankan secara menyeluruh. Ia tak memadai bila hanya berwujud materi kuliah, sebab mesti pula terpancar dalam sistem, aturan, dan budaya kampus itu sendiri. Konsistensi antara apa yang diajarkan dan apa yang dipraktikkan menjadi kunci keberhasilannya.</w:t>
       </w:r>
     </w:p>
     <w:p>
@@ -11650,7 +11650,7 @@
           <w:i w:val="0"/>
           <w:sz w:val="24"/>
         </w:rPr>
-        <w:t>Tujuan akhir pendidikan antikorupsi adalah lahirnya generasi yang berintegritas. Generasi berintegritas bukan hanya menolak korupsi ketika kelak menjadi pejabat, tetapi sudah membiasakan kejujuran sejak masih menjadi mahasiswa. Integritas yang dilatih sejak dini akan menjadi karakter yang kuat di kemudian hari.</w:t>
+        <w:t>Sasaran pamungkas pendidikan antikorupsi ialah hadirnya generasi yang berintegritas. Generasi yang berintegritas tidak menanti menjadi pejabat untuk menampik korupsi, melainkan telah mengakrabi kejujuran semasa masih berstatus mahasiswa. Integritas yang diasah sejak dini kelak mengeras menjadi karakter yang kukuh.</w:t>
       </w:r>
     </w:p>
     <w:p>
@@ -11666,7 +11666,7 @@
           <w:i w:val="0"/>
           <w:sz w:val="24"/>
         </w:rPr>
-        <w:t>Membangun generasi berintegritas menuntut keteladanan dari berbagai pihak. Dosen yang adil dalam menilai, kampus yang tegas terhadap kecurangan, dan keluarga yang menanamkan kejujuran semuanya saling melengkapi. Tanpa keteladanan, ajakan untuk berintegritas hanya akan menjadi kata-kata kosong.</w:t>
+        <w:t>Menumbuhkan generasi berintegritas menuntut keteladanan dari banyak pihak. Pengajar yang objektif dalam menilai, institusi yang tegas menindak kecurangan, serta keluarga yang menanam nilai kejujuran saling menyempurnakan satu sama lain. Tanpa contoh nyata, seruan untuk berintegritas hanya akan berhenti sebagai kata-kata hampa.</w:t>
       </w:r>
     </w:p>
     <w:p>
@@ -11682,7 +11682,7 @@
           <w:i w:val="0"/>
           <w:sz w:val="24"/>
         </w:rPr>
-        <w:t>Mahasiswa dapat menjadi bagian dari generasi ini melalui keputusan kecil setiap hari, seperti mengerjakan tugas dengan jujur, mengakui kesalahan, dan berani menolak ajakan berbuat curang. Dari kebiasaan inilah lahir pemimpin masa depan yang bersih dan dapat dipercaya.</w:t>
+        <w:t>Mahasiswa bisa menjadi bagian dari generasi tersebut lewat pilihan kecil saban hari, semisal menggarap tugas secara jujur, mengakui keliru, serta berani menampik ajakan berbuat curang. Dari kebiasaan semacam itulah muncul pemimpin masa depan yang bersih lagi tepercaya.</w:t>
       </w:r>
     </w:p>
     <w:p>
@@ -11716,7 +11716,7 @@
           <w:i w:val="0"/>
           <w:sz w:val="24"/>
         </w:rPr>
-        <w:t>Korupsi adalah penyalahgunaan kepercayaan untuk keuntungan pribadi yang merugikan kepentingan umum, dengan dampak luas pada ekonomi, kehidupan sosial, dan moral bangsa. Pengaturannya tertuang dalam Undang-Undang Nomor 31 Tahun 1999 dan Undang-Undang Nomor 20 Tahun 2001.</w:t>
+        <w:t>Korupsi pada hakikatnya mengkhianati amanah demi laba pribadi yang mencederai kepentingan umum, dan akibatnya menjalar ke perekonomian, kehidupan sosial, sampai moral bangsa. Ketentuannya termaktub dalam Undang-Undang Nomor 31 Tahun 1999 serta Undang-Undang Nomor 20 Tahun 2001.</w:t>
       </w:r>
     </w:p>
     <w:p>
@@ -11732,7 +11732,7 @@
           <w:i w:val="0"/>
           <w:sz w:val="24"/>
         </w:rPr>
-        <w:t>Pencegahan korupsi bertumpu pada penanaman nilai kejujuran, tanggung jawab, dan keberanian, yang dimulai dari kehidupan sehari-hari dan lingkungan kampus. Sebagai penutup mini book ini, materi antikorupsi merangkum semangat seluruh pembahasan, yaitu membentuk mahasiswa menjadi warga negara yang berintegritas, sadar hukum, dan siap berkontribusi bagi bangsa.</w:t>
+        <w:t>Pencegahan korupsi berpijak pada penyemaian nilai kejujuran, tanggung jawab, serta keberanian, yang dimulai dari keseharian dan lingkungan kampus. Sebagai penutup mini book ini, materi antikorupsi merangkum semangat seluruh pembahasan, yaitu membentuk mahasiswa menjadi warga negara yang berintegritas, sadar hukum, dan siap berkontribusi bagi bangsa.</w:t>
       </w:r>
     </w:p>
     <w:p>

</xml_diff>

<commit_message>
Kumpulan FINAL: semua 6 buku (PDF + DOCX) dalam satu folder untuk unduh sekaligus
- B1 Nurul Syifa, B2 Naila (versi dedup), B3 Balqis Sandra Lejla, B4 Lidya Ellen Febriasalsa, B5 Nurjali Sangadji, B6 Revalina Damayanti
- Semua lolos QA aturan dosen; kemiripan antar-buku tertinggi 1.47% (aman)
</commit_message>
<xml_diff>
--- a/FINAL/Buku 2 - Naila - PKN - FINISH.docx
+++ b/FINAL/Buku 2 - Naila - PKN - FINISH.docx
@@ -795,7 +795,7 @@
         </w:rPr>
         <w:t>BAB 3  INTEGRASI NASIONAL</w:t>
         <w:tab/>
-        <w:t>21</w:t>
+        <w:t>20</w:t>
       </w:r>
     </w:p>
     <w:p>
@@ -1054,7 +1054,7 @@
         </w:rPr>
         <w:t>BAB 4  NEGARA DAN KONSTITUSI</w:t>
         <w:tab/>
-        <w:t>27</w:t>
+        <w:t>26</w:t>
       </w:r>
     </w:p>
     <w:p>
@@ -1333,7 +1333,7 @@
         </w:rPr>
         <w:t>BAB 5  HAK DAN KEWAJIBAN WARGA NEGARA</w:t>
         <w:tab/>
-        <w:t>34</w:t>
+        <w:t>33</w:t>
       </w:r>
     </w:p>
     <w:p>
@@ -1632,7 +1632,7 @@
         </w:rPr>
         <w:t>BAB 6  PENEGAKAN HUKUM YANG BERKEADILAN</w:t>
         <w:tab/>
-        <w:t>41</w:t>
+        <w:t>40</w:t>
       </w:r>
     </w:p>
     <w:p>
@@ -1911,7 +1911,7 @@
         </w:rPr>
         <w:t>BAB 7  GEOPOLITIK DAN GEOSTRATEGI</w:t>
         <w:tab/>
-        <w:t>48</w:t>
+        <w:t>47</w:t>
       </w:r>
     </w:p>
     <w:p>
@@ -2170,7 +2170,7 @@
         </w:rPr>
         <w:t>BAB 8  ANTI KORUPSI</w:t>
         <w:tab/>
-        <w:t>54</w:t>
+        <w:t>53</w:t>
       </w:r>
     </w:p>
     <w:p>
@@ -2469,7 +2469,7 @@
         </w:rPr>
         <w:t>DAFTAR PUSTAKA</w:t>
         <w:tab/>
-        <w:t>61</w:t>
+        <w:t>60</w:t>
       </w:r>
     </w:p>
     <w:p>
@@ -3635,7 +3635,7 @@
           <w:i w:val="0"/>
           <w:sz w:val="24"/>
         </w:rPr>
-        <w:t>Salah satu ciri khas Pendidikan Kewarganegaraan adalah keterkaitannya yang erat dengan pembentukan karakter. Pengetahuan tentang negara dan hukum akan kehilangan makna bila tidak disertai sikap yang baik. Seseorang dapat saja hafal banyak konsep, tetapi tetap berlaku tidak jujur. Di titik inilah pendidikan karakter menjadi bagian yang tidak terpisahkan dari mata kuliah ini.</w:t>
+        <w:t>Satu penanda khas Pendidikan Kewarganegaraan terletak pada eratnya kaitan dengan penempaan watak. Pengetahuan tentang negara dan hukum akan kehilangan makna bila tidak disertai sikap yang baik. Seseorang dapat saja hafal banyak konsep, tetapi tetap berlaku tidak jujur. Di titik inilah pendidikan karakter menjadi bagian yang tidak terpisahkan dari mata kuliah ini.</w:t>
       </w:r>
     </w:p>
     <w:p>
@@ -3651,7 +3651,7 @@
           <w:i w:val="0"/>
           <w:sz w:val="24"/>
         </w:rPr>
-        <w:t>Nilai seperti jujur, disiplin, adil, dan bertanggung jawab tidak dapat ditanamkan hanya melalui ceramah. Nilai tumbuh melalui kebiasaan dan keteladanan. Karena itu, ruang kelas Pendidikan Kewarganegaraan sebaiknya juga menjadi ruang latihan, tempat mahasiswa belajar berargumen dengan santun, menghargai perbedaan pendapat, dan berani bersikap jujur.</w:t>
+        <w:t>Nilai semisal jujur, disiplin, adil, dan bertanggung jawab mustahil ditanamkan semata lewat ceramah. Nilai tumbuh melalui kebiasaan dan keteladanan. Oleh sebab itu, kelas Pendidikan Kewarganegaraan idealnya menjadi arena berlatih, yakni tempat mahasiswa mengasah cara berargumen dengan santun, menghargai beda pandangan, serta berani berlaku jujur.</w:t>
       </w:r>
     </w:p>
     <w:p>
@@ -3667,7 +3667,7 @@
           <w:i w:val="0"/>
           <w:sz w:val="24"/>
         </w:rPr>
-        <w:t>Pembentukan karakter melalui mata kuliah ini bersifat jangka panjang. Karakter yang terbentuk di bangku kuliah akan terbawa hingga dunia kerja. Lulusan yang terbiasa jujur dan bertanggung jawab akan menjadi tenaga profesional yang dapat dipercaya, sekaligus warga negara yang menjaga nama baik bangsanya.</w:t>
+        <w:t>Pembentukan karakter melalui mata kuliah ini bersifat jangka panjang. Watak yang terbangun selama kuliah akan ikut terbawa sampai ke dunia kerja. Sarjana yang terbiasa berlaku jujur dan bertanggung jawab kelak menjelma menjadi tenaga kerja yang tepercaya, sekaligus warga yang turut menjaga citra bangsanya.</w:t>
       </w:r>
     </w:p>
     <w:p>
@@ -3717,7 +3717,7 @@
           <w:i w:val="0"/>
           <w:sz w:val="24"/>
         </w:rPr>
-        <w:t>Kajian Pendidikan Kewarganegaraan cukup luas karena menyangkut hubungan antara warga negara dengan negaranya. Di dalamnya termasuk persoalan identitas bangsa, persatuan, sistem ketatanegaraan, hak dan kewajiban, hukum, wilayah negara, hingga persoalan moral seperti korupsi. Cakupan yang luas ini menunjukkan bahwa mata kuliah ini menyentuh hampir seluruh aspek kehidupan berbangsa.</w:t>
+        <w:t>Cakupan kajian Pendidikan Kewarganegaraan terbilang luas karena menyentuh relasi antara warga dengan negaranya. Cakupannya membentang dari persatuan bangsa, jati diri, urusan ketatanegaraan dan hukum, hak beserta kewajiban, batas wilayah, hingga isu moral seperti korupsi. Cakupan yang luas ini menunjukkan bahwa mata kuliah ini menyentuh hampir seluruh aspek kehidupan berbangsa.</w:t>
       </w:r>
     </w:p>
     <w:p>
@@ -3733,7 +3733,7 @@
           <w:i w:val="0"/>
           <w:sz w:val="24"/>
         </w:rPr>
-        <w:t>Walaupun terlihat beragam, seluruh topik tersebut sebenarnya berpusat pada satu pertanyaan mendasar, yaitu bagaimana hidup bersama secara adil dan damai dalam sebuah negara. Pertanyaan inilah yang menjadi benang merah seluruh bab dalam mini book ini, mulai dari identitas nasional hingga pendidikan antikorupsi.</w:t>
+        <w:t>Kendati tampak beraneka, segenap topik itu pada dasarnya bermuara pada satu pertanyaan pokok, yakni bagaimana hidup berdampingan secara adil dan damai dalam suatu negara. Persoalan itulah yang merajut seluruh bab dalam buku ringkas ini, terbentang dari identitas nasional sampai pendidikan antikorupsi.</w:t>
       </w:r>
     </w:p>
     <w:p>
@@ -3749,7 +3749,7 @@
           <w:i w:val="0"/>
           <w:sz w:val="24"/>
         </w:rPr>
-        <w:t>Karena keterkaitan antartopik begitu erat, mahasiswa sebaiknya tidak memandang setiap bab secara terpisah. Identitas nasional berkaitan dengan integrasi, integrasi berkaitan dengan konstitusi, dan seterusnya. Semakin mahasiswa mampu melihat keterkaitan ini, semakin utuh pula pemahamannya tentang kehidupan bernegara.</w:t>
+        <w:t>Karena keterkaitan antartopik begitu erat, mahasiswa sebaiknya tidak memandang setiap bab secara terpisah. Identitas nasional bertaut dengan integrasi, integrasi bertaut dengan konstitusi, demikian seterusnya. Semakin mahasiswa mampu melihat keterkaitan ini, semakin utuh pula pemahamannya tentang kehidupan bernegara.</w:t>
       </w:r>
     </w:p>
     <w:p>
@@ -3783,7 +3783,7 @@
           <w:i w:val="0"/>
           <w:sz w:val="24"/>
         </w:rPr>
-        <w:t>Mahasiswa sering disebut sebagai kelompok terdidik yang diharapkan menjadi penggerak perubahan. Sebutan ini bukan sekadar pujian, melainkan tanggung jawab. Sebagai warga negara yang memperoleh kesempatan belajar lebih tinggi, mahasiswa diharapkan mampu menjadi contoh dalam bersikap dan berpikir di tengah masyarakat.</w:t>
+        <w:t>Mahasiswa kerap dijuluki kalangan terpelajar yang diharapkan menjadi motor perubahan. Julukan tersebut bukan semata sanjungan, melainkan sebuah tanggung jawab. Selaku warga yang beruntung mengenyam pendidikan lebih tinggi, mahasiswa diharapkan sanggup menjadi panutan dalam bersikap maupun bernalar di tengah masyarakat.</w:t>
       </w:r>
     </w:p>
     <w:p>
@@ -3799,7 +3799,7 @@
           <w:i w:val="0"/>
           <w:sz w:val="24"/>
         </w:rPr>
-        <w:t>Peran tersebut tidak harus berbentuk hal besar. Menolak menyontek, berani jujur dalam tugas, aktif dalam kegiatan sosial, dan menjaga sikap di media sosial sudah merupakan kontribusi nyata. Dari kebiasaan kecil yang konsisten, mahasiswa melatih diri menjadi warga negara yang dapat dipercaya di kemudian hari.</w:t>
+        <w:t>Peran tersebut tidak harus berbentuk hal besar. Enggan menyontek, berani berlaku jujur dalam tugas, giat berkegiatan sosial, serta menjaga tutur di media sosial sudah tergolong sumbangan yang nyata. Lewat kebiasaan kecil yang ajeg, mahasiswa menggembleng dirinya menjadi warga yang layak dipercaya kelak.</w:t>
       </w:r>
     </w:p>
     <w:p>
@@ -3815,7 +3815,7 @@
           <w:i w:val="0"/>
           <w:sz w:val="24"/>
         </w:rPr>
-        <w:t>Selain menjadi teladan, mahasiswa juga dapat menjadi penghubung antara dunia kampus dan masyarakat melalui penelitian dan pengabdian. Dengan begitu, ilmu yang dipelajari tidak berhenti sebagai teori, tetapi berlanjut menjadi tindakan yang bermanfaat bagi orang banyak.</w:t>
+        <w:t>Di samping menjadi panutan, mahasiswa juga sanggup menjembatani dunia kampus dengan masyarakat melalui penelitian serta pengabdian. Dengan cara itu, ilmu yang ditimba tidak mandek sebagai teori, melainkan berlanjut menjadi tindakan yang berfaedah bagi orang banyak.</w:t>
       </w:r>
     </w:p>
     <w:p>
@@ -3849,7 +3849,7 @@
           <w:i w:val="0"/>
           <w:sz w:val="24"/>
         </w:rPr>
-        <w:t>Pendidikan Kewarganegaraan di perguruan tinggi adalah mata kuliah wajib yang berlandaskan Pancasila, UUD NRI Tahun 1945, Undang-Undang Nomor 20 Tahun 2003, dan Undang-Undang Nomor 12 Tahun 2012. Tujuannya membentuk warga negara yang cerdas, berkarakter, dan partisipatif.</w:t>
+        <w:t>Pada jenjang perguruan tinggi, Pendidikan Kewarganegaraan berstatus mata kuliah wajib. Pijakannya meliputi Pancasila, UUD NRI Tahun 1945, ditambah dua undang-undang, yakni Nomor 20 Tahun 2003 dan Nomor 12 Tahun 2012. Tujuannya membentuk warga negara yang cerdas, berkarakter, dan partisipatif.</w:t>
       </w:r>
     </w:p>
     <w:p>
@@ -3865,7 +3865,7 @@
           <w:i w:val="0"/>
           <w:sz w:val="24"/>
         </w:rPr>
-        <w:t>Berbeda dari jenjang sekolah, pendekatannya menekankan analisis dan penerapan. Di era digital, perannya semakin penting sebagai penyaring informasi dan penjaga sikap kritis. Bagi mahasiswa Bimbingan dan Konseling, pemahaman ini menjadi bekal untuk menghormati keberagaman dan menempatkan persoalan secara adil.</w:t>
+        <w:t>Berbeda dari jenjang sekolah, pendekatannya menekankan analisis dan penerapan. Pada era digital, perannya kian vital selaku penyaring informasi dan penjaga daya kritis. Bagi mahasiswa Bimbingan dan Konseling, pemahaman ini menjadi bekal untuk menghormati keberagaman dan menempatkan persoalan secara adil.</w:t>
       </w:r>
     </w:p>
     <w:p>
@@ -4399,7 +4399,7 @@
           <w:i w:val="0"/>
           <w:sz w:val="24"/>
         </w:rPr>
-        <w:t>Identitas nasional juga hadir melalui bahasa, budaya, dan simbol negara yang digunakan bersama. Pengaturan mengenai bendera, bahasa, lambang negara, dan lagu kebangsaan ditegaskan dalam Undang-Undang Nomor 24 Tahun 2009, yang menempatkan simbol-simbol ini sebagai sesuatu yang memiliki kedudukan hukum, bukan sekadar atribut seremonial.</w:t>
+        <w:t>Identitas nasional juga hadir melalui bahasa, budaya, dan simbol negara yang digunakan bersama. Aturan ihwal bendera, bahasa, lambang negara, dan lagu kebangsaan dikukuhkan dalam Undang-Undang Nomor 24 Tahun 2009, yang menempatkan simbol-simbol itu sebagai hal berkedudukan hukum, bukan sekadar atribut upacara.</w:t>
       </w:r>
     </w:p>
     <w:p>
@@ -4549,7 +4549,7 @@
           <w:i w:val="0"/>
           <w:sz w:val="24"/>
         </w:rPr>
-        <w:t>Identitas nasional Indonesia terbentuk melalui pengalaman sejarah yang panjang. Pengalaman dijajah selama berabad-abad justru menumbuhkan kesadaran bahwa berbagai suku dan daerah memiliki nasib yang sama dan perlu bersatu. Dari kesadaran inilah benih identitas kebangsaan mulai tumbuh.</w:t>
+        <w:t>Identitas nasional Indonesia terbentuk melalui pengalaman sejarah yang panjang. Penjajahan yang membentang berabad-abad ternyata menyuburkan kesadaran bahwa beraneka suku dan daerah sedang berbagi nasib serupa sehingga perlu berhimpun. Dari kesadaran inilah benih identitas kebangsaan mulai tumbuh.</w:t>
       </w:r>
     </w:p>
     <w:p>
@@ -4565,7 +4565,7 @@
           <w:i w:val="0"/>
           <w:sz w:val="24"/>
         </w:rPr>
-        <w:t>Peristiwa seperti Kebangkitan Nasional, Sumpah Pemuda, dan Proklamasi Kemerdekaan menjadi tonggak yang memperkuat rasa kebangsaan. Identitas nasional dengan demikian bukan pemberian yang turun begitu saja, melainkan hasil perjuangan dan kesadaran kolektif yang diwariskan antargenerasi. Memahami sejarah ini membantu mahasiswa menyadari mengapa persatuan layak dijaga.</w:t>
+        <w:t>Sejumlah tonggak sejarah, mulai dari Kebangkitan Nasional, kemudian Sumpah Pemuda, sampai Proklamasi, ikut meneguhkan rasa kebangsaan. Identitas nasional dengan demikian bukan pemberian yang turun begitu saja, melainkan hasil perjuangan dan kesadaran kolektif yang diwariskan antargenerasi. Memahami sejarah ini membantu mahasiswa menyadari mengapa persatuan layak dijaga.</w:t>
       </w:r>
     </w:p>
     <w:p>
@@ -4599,7 +4599,7 @@
           <w:i w:val="0"/>
           <w:sz w:val="24"/>
         </w:rPr>
-        <w:t>Generasi muda saat ini tumbuh bersama teknologi digital dan menyerap banyak nilai dari luar negeri. Identitas nasional dapat melemah bila mereka lebih mengagumi budaya asing daripada budayanya sendiri. Namun teknologi juga membuka peluang, karena banyak anak muda justru memanfaatkan media sosial untuk memperkenalkan budaya Indonesia ke panggung yang lebih luas.</w:t>
+        <w:t>Kaum muda masa kini dibesarkan bersama teknologi digital dan banyak menyerap nilai dari mancanegara. Jati diri bangsa bisa pudar manakala mereka lebih mengelu-elukan budaya asing ketimbang budaya sendiri. Namun teknologi juga membuka peluang, karena banyak anak muda justru memanfaatkan media sosial untuk memperkenalkan budaya Indonesia ke panggung yang lebih luas.</w:t>
       </w:r>
     </w:p>
     <w:p>
@@ -4615,7 +4615,7 @@
           <w:i w:val="0"/>
           <w:sz w:val="24"/>
         </w:rPr>
-        <w:t>Kunci dari semuanya terletak pada sikap. Teknologi sebaiknya dilihat sebagai alat, bukan tujuan. Bila digunakan dengan bijak, dunia digital dapat menjadi sarana memperkuat identitas nasional. Mahasiswa dapat menjadi teladan dengan menampilkan kebanggaan terhadap bangsa melalui karya digital yang positif dan bermutu.</w:t>
+        <w:t>Kunci dari semuanya terletak pada sikap. Teknologi semestinya diposisikan sebagai sarana, bukan sebagai tujuan akhir. Bila dimanfaatkan secara bijak, ruang digital justru bisa menjadi sarana mengokohkan identitas nasional. Mahasiswa bisa menjadi panutan dengan memperlihatkan rasa bangga pada bangsa lewat karya digital yang positif lagi bermutu.</w:t>
       </w:r>
     </w:p>
     <w:p>
@@ -4649,7 +4649,7 @@
           <w:i w:val="0"/>
           <w:sz w:val="24"/>
         </w:rPr>
-        <w:t>Mahasiswa berada pada posisi yang strategis untuk merawat identitas nasional. Sebagai kelompok terdidik, mereka mampu berpikir kritis, sekaligus cukup muda untuk menjadi penggerak perubahan. Peran ini dapat diwujudkan melalui penggunaan bahasa Indonesia yang baik, penghargaan terhadap tradisi daerah lain, dan penolakan terhadap ujaran yang merendahkan kelompok tertentu.</w:t>
+        <w:t>Mahasiswa berada pada posisi yang strategis untuk merawat identitas nasional. Selaku kalangan terpelajar, mereka cakap bernalar kritis, sekaligus masih cukup belia untuk menjadi motor perubahan. Peran ini dapat diwujudkan melalui penggunaan bahasa Indonesia yang baik, penghargaan terhadap tradisi daerah lain, dan penolakan terhadap ujaran yang merendahkan kelompok tertentu.</w:t>
       </w:r>
     </w:p>
     <w:p>
@@ -4665,7 +4665,7 @@
           <w:i w:val="0"/>
           <w:sz w:val="24"/>
         </w:rPr>
-        <w:t>Mahasiswa juga dapat memperkuat identitas nasional melalui kegiatan akademik, seperti menulis karya ilmiah tentang isu lokal, budaya daerah, atau tokoh bangsa. Proses ini membuat identitas nasional tidak sekadar diingat, tetapi dipahami dan dihidupkan kembali dengan cara yang relevan bagi generasi muda.</w:t>
+        <w:t>Mahasiswa pun bisa mengokohkan identitas nasional melalui aktivitas akademik, misalnya menyusun karya ilmiah seputar isu lokal, budaya daerah, atau tokoh bangsa. Proses ini membuat identitas nasional tidak sekadar diingat, tetapi dipahami dan dihidupkan kembali dengan cara yang relevan bagi generasi muda.</w:t>
       </w:r>
     </w:p>
     <w:p>
@@ -4681,7 +4681,7 @@
           <w:i w:val="0"/>
           <w:sz w:val="24"/>
         </w:rPr>
-        <w:t>Kampus pada dasarnya adalah miniatur Indonesia. Di sana mahasiswa dari berbagai daerah berkumpul, berdiskusi, dan bekerja sama. Bila ruang itu dikelola dengan sikap saling menghormati, semboyan Bhinneka Tunggal Ika tidak lagi berhenti sebagai hafalan, melainkan menjadi pengalaman yang dirasakan setiap hari.</w:t>
+        <w:t>Kampus pada dasarnya adalah miniatur Indonesia. Di tempat itu mahasiswa lintas daerah berhimpun, bertukar pikiran, dan bahu-membahu. Apabila ruang itu diisi sikap saling menghormati, Bhinneka Tunggal Ika berhenti menjadi hafalan dan menjelma pengalaman nyata sehari-hari.</w:t>
       </w:r>
     </w:p>
     <w:p>
@@ -4731,7 +4731,7 @@
           <w:i w:val="0"/>
           <w:sz w:val="24"/>
         </w:rPr>
-        <w:t>Nilai di balik tradisi sering kali lebih penting daripada bentuk luarnya. Gotong royong, musyawarah, sopan santun, dan kepedulian terhadap lingkungan sosial adalah nilai budaya yang masih relevan hingga kini. Nilai-nilai inilah yang sebenarnya menjadi inti identitas, sementara bentuk kesenian adalah ungkapan lahirnya.</w:t>
+        <w:t>Makna yang tersimpan di balik tradisi acap lebih berarti ketimbang tampilan luarnya. Gotong royong, musyawarah, sopan santun, dan kepedulian terhadap lingkungan sosial adalah nilai budaya yang masih relevan hingga kini. Nilai-nilai itulah inti sejati dari identitas, sedangkan wujud kesenian merupakan ungkapan luarnya.</w:t>
       </w:r>
     </w:p>
     <w:p>
@@ -4747,7 +4747,7 @@
           <w:i w:val="0"/>
           <w:sz w:val="24"/>
         </w:rPr>
-        <w:t>Namun budaya juga menghadapi tekanan modernisasi. Gaya hidup yang serba cepat dan sikap individualistis dapat menggeser kebiasaan lama. Karena itu, pelestarian budaya menjadi tanggung jawab bersama, termasuk generasi muda yang justru dapat mengenalkan budaya daerah ke panggung yang lebih luas melalui teknologi.</w:t>
+        <w:t>Namun budaya juga menghadapi tekanan modernisasi. Gaya hidup yang serba cepat dan sikap individualistis dapat menggeser kebiasaan lama. Karena itu, melestarikan budaya merupakan tugas bersama, termasuk anak muda yang justru sanggup membawa budaya daerah ke panggung lebih luas melalui teknologi.</w:t>
       </w:r>
     </w:p>
     <w:p>
@@ -4797,7 +4797,7 @@
           <w:i w:val="0"/>
           <w:sz w:val="24"/>
         </w:rPr>
-        <w:t>Bela negara sering disalahpahami sebagai urusan militer semata. Padahal, bela negara juga berarti menjaga identitas nasional dari berbagai ancaman yang dapat memecah belah bangsa, seperti radikalisme, provokasi bernuansa suku dan agama, serta berita bohong yang sengaja disebarkan.</w:t>
+        <w:t>Bela negara acap disalahartikan sebagai semata-mata urusan ketentaraan. Pada kenyataannya, membela negara juga mencakup upaya melindungi jati diri bangsa dari ragam ancaman yang berpotensi memecah persatuan, di antaranya paham radikal, hasutan berbau suku dan agama, serta hoaks yang sengaja diproduksi.</w:t>
       </w:r>
     </w:p>
     <w:p>
@@ -4813,7 +4813,7 @@
           <w:i w:val="0"/>
           <w:sz w:val="24"/>
         </w:rPr>
-        <w:t>Setiap warga negara dapat berperan dalam bela negara melalui tindakan sehari-hari. Menjaga kerukunan, menghargai perbedaan agama, menolak ujaran kebencian, dan aktif dalam kehidupan berdemokrasi adalah bentuk bela negara yang dapat dilakukan siapa saja. Bela negara dengan demikian dimulai dari hal-hal kecil yang dekat dengan kehidupan.</w:t>
+        <w:t>Tiap warga negara dapat mengambil bagian dalam bela negara lewat perbuatan sehari-hari. Merawat kerukunan, menghormati keragaman keyakinan, menampik ujaran kebencian, serta terlibat dalam kehidupan demokrasi merupakan wujud bela negara yang terbuka bagi setiap orang. Dengan demikian, membela negara berawal dari perkara-perkara kecil yang akrab dengan keseharian.</w:t>
       </w:r>
     </w:p>
     <w:p>
@@ -4829,7 +4829,7 @@
           <w:i w:val="0"/>
           <w:sz w:val="24"/>
         </w:rPr>
-        <w:t>Bagi mahasiswa, bela negara dapat diwujudkan melalui prestasi, integritas, dan kepedulian sosial. Menjaga nama baik bangsa di kancah akademik dan menyebarkan semangat positif di ruang digital merupakan bentuk bela negara yang relevan dengan zaman sekarang, sekaligus memperkuat identitas nasional.</w:t>
+        <w:t>Bagi mahasiswa, membela negara bisa diejawantahkan lewat prestasi, integritas, serta kepedulian sosial. Menjaga nama baik bangsa pada arena akademik serta menebar semangat positif di ruang digital merupakan wujud bela negara yang selaras dengan zaman kini, sekaligus mengokohkan identitas nasional.</w:t>
       </w:r>
     </w:p>
     <w:p>
@@ -4863,7 +4863,7 @@
           <w:i w:val="0"/>
           <w:sz w:val="24"/>
         </w:rPr>
-        <w:t>Menjaga identitas nasional menuntut usaha yang terus-menerus melalui pendidikan, pelestarian budaya, penggunaan bahasa Indonesia yang baik, dan sikap menghargai keberagaman. Identitas tidak cukup hanya dipelajari di ruang kelas, tetapi perlu dibiasakan dalam kehidupan sehari-hari agar tidak berhenti sebagai materi hafalan.</w:t>
+        <w:t>Pemeliharaan identitas nasional memerlukan ikhtiar yang berkelanjutan, baik lewat jalur pendidikan, pelestarian kebudayaan, pemakaian bahasa Indonesia secara baik, maupun sikap menghormati keberagaman. Jati diri tak memadai bila sekadar dipelajari di kelas, sebab ia mesti dibiasakan dalam keseharian supaya tidak berhenti menjadi bahan hafalan.</w:t>
       </w:r>
     </w:p>
     <w:p>
@@ -4879,7 +4879,7 @@
           <w:i w:val="0"/>
           <w:sz w:val="24"/>
         </w:rPr>
-        <w:t>Peran keluarga juga tidak kalah penting. Nilai dasar seperti kejujuran, tanggung jawab, dan cinta tanah air pertama kali ditanamkan di lingkungan keluarga. Bila fondasi itu kuat, upaya kampus dan negara dalam memperkuat identitas akan jauh lebih mudah. Dengan demikian, menjaga identitas nasional adalah kerja bersama keluarga, kampus, masyarakat, dan negara.</w:t>
+        <w:t>Peran keluarga juga tidak kalah penting. Nilai pokok semisal kejujuran, tanggung jawab, dan kecintaan pada tanah air mula-mula disemai dalam lingkungan keluarga. Apabila pondasi tersebut kukuh, ikhtiar kampus dan negara untuk mengukuhkan identitas akan terasa jauh lebih ringan. Maka dari itu, merawat identitas nasional merupakan kerja kolektif keluarga, kampus, masyarakat, dan negara.</w:t>
       </w:r>
     </w:p>
     <w:p>
@@ -4929,7 +4929,7 @@
           <w:i w:val="0"/>
           <w:sz w:val="24"/>
         </w:rPr>
-        <w:t>Identitas nasional adalah jati diri bangsa yang terbentuk dari sejarah, bahasa, budaya, dan simbol negara, serta diikat oleh nilai-nilai Pancasila. Identitas ini dibangun melalui proses panjang dan perlu dirawat secara sadar.</w:t>
+        <w:t>Identitas nasional merupakan jati diri bangsa yang tersusun dari sejarah, bahasa, budaya, dan simbol negara, lalu dipersatukan oleh nilai-nilai Pancasila. Identitas ini dibangun melalui proses panjang dan perlu dirawat secara sadar.</w:t>
       </w:r>
     </w:p>
     <w:p>
@@ -5563,7 +5563,7 @@
           <w:i w:val="0"/>
           <w:sz w:val="24"/>
         </w:rPr>
-        <w:t>Integrasi nasional membutuhkan toleransi sebagai perekat. Toleransi berarti bersedia hidup berdampingan dengan mereka yang berbeda, sekaligus menghormati hak setiap orang untuk menjadi dirinya sendiri. Tanpa toleransi, keberagaman yang dimiliki Indonesia mudah berubah menjadi sumber gesekan.</w:t>
+        <w:t>Integrasi nasional membutuhkan toleransi sebagai perekat. Toleransi bermakna kesediaan berdampingan dengan pihak yang tidak sama, seraya menjunjung hak tiap individu untuk tetap menjadi dirinya. Tanpa toleransi, keberagaman yang dimiliki Indonesia mudah berubah menjadi sumber gesekan.</w:t>
       </w:r>
     </w:p>
     <w:p>
@@ -5579,7 +5579,7 @@
           <w:i w:val="0"/>
           <w:sz w:val="24"/>
         </w:rPr>
-        <w:t>Meski demikian, toleransi tetap memiliki batas. Sikap menghargai perbedaan tidak berarti membiarkan segala hal terjadi, termasuk yang melanggar hukum atau nilai kemanusiaan. Toleransi yang sehat selalu disertai prinsip, sehingga kerukunan yang terbangun bukan kerukunan semu, melainkan kerukunan yang berpijak pada keadilan.</w:t>
+        <w:t>Meski demikian, toleransi tetap memiliki batas. Menghargai perbedaan bukan berarti merestui segala sesuatu terjadi, termasuk hal yang melanggar hukum maupun nilai kemanusiaan. Toleransi yang sehat selalu disertai prinsip, sehingga kerukunan yang terbangun bukan kerukunan semu, melainkan kerukunan yang berpijak pada keadilan.</w:t>
       </w:r>
     </w:p>
     <w:p>
@@ -5663,7 +5663,7 @@
           <w:i w:val="0"/>
           <w:sz w:val="24"/>
         </w:rPr>
-        <w:t>Negara Kesatuan Republik Indonesia adalah wujud konkret dari integrasi nasional. NKRI bukan sekadar gagasan, melainkan kenyataan politik dan hukum yang dijaga oleh konstitusi serta ideologi Pancasila. Menjaga keutuhannya merupakan tanggung jawab seluruh rakyat, bukan hanya aparat negara.</w:t>
+        <w:t>Negara Kesatuan Republik Indonesia adalah wujud konkret dari integrasi nasional. Negara Kesatuan Republik Indonesia bukanlah sebatas gagasan, melainkan realitas politik dan hukum yang dipagari konstitusi serta ideologi Pancasila. Menjaga keutuhannya merupakan tanggung jawab seluruh rakyat, bukan hanya aparat negara.</w:t>
       </w:r>
     </w:p>
     <w:p>
@@ -5679,7 +5679,7 @@
           <w:i w:val="0"/>
           <w:sz w:val="24"/>
         </w:rPr>
-        <w:t>Di era digital, salah satu ancaman terhadap integrasi datang dari ruang media sosial. Informasi menyebar lebih cepat daripada kemampuan masyarakat memverifikasinya, sehingga konflik kadang bermula dari kesalahpahaman atau hasutan yang tidak berdasar. Di sinilah etika bermedia sosial menjadi penting.</w:t>
+        <w:t>Di era digital, salah satu ancaman terhadap integrasi datang dari ruang media sosial. Arus informasi melaju lebih kencang ketimbang kesanggupan masyarakat memverifikasinya, sehingga konflik kerap berawal dari salah paham atau hasutan tak berdasar. Pada titik inilah etika dalam bermedia sosial memegang peran penting.</w:t>
       </w:r>
     </w:p>
     <w:p>
@@ -5695,7 +5695,7 @@
           <w:i w:val="0"/>
           <w:sz w:val="24"/>
         </w:rPr>
-        <w:t>Mahasiswa dapat menjaga integrasi di ruang digital dengan memeriksa kebenaran informasi sebelum membagikannya dan menahan diri dari komentar yang memperkeruh suasana. Sebagai kelompok terdidik, mereka diharapkan menjadi penyaring informasi, bukan penyebar provokasi yang memecah belah masyarakat.</w:t>
+        <w:t>Mahasiswa bisa merawat integrasi di ruang digital dengan menelaah kebenaran informasi sebelum menyebarkannya serta menahan komentar yang memanaskan suasana. Selaku kalangan terpelajar, mereka diharapkan berperan sebagai penyaring informasi, bukan penyulut provokasi yang memecah masyarakat.</w:t>
       </w:r>
     </w:p>
     <w:p>
@@ -5729,7 +5729,7 @@
           <w:i w:val="0"/>
           <w:sz w:val="24"/>
         </w:rPr>
-        <w:t>Sejarah integrasi nasional Indonesia tidak dapat dilepaskan dari peristiwa Sumpah Pemuda pada tahun 1928. Pada peristiwa itu, para pemuda dari berbagai daerah, suku, dan latar belakang bersatu dalam satu tekad, yaitu satu tanah air, satu bangsa, dan satu bahasa. Mereka rela mengesampingkan perbedaan demi tujuan yang lebih besar.</w:t>
+        <w:t>Sejarah integrasi nasional Indonesia tidak dapat dilepaskan dari peristiwa Sumpah Pemuda pada tahun 1928. Pada momen itu, pemuda dari beragam daerah dan suku merapatkan tekad menjadi satu ikrar, yaitu satu tanah air, satu bangsa, satu bahasa. Mereka ikhlas menepikan perbedaan demi cita-cita yang lebih besar.</w:t>
       </w:r>
     </w:p>
     <w:p>
@@ -5811,7 +5811,7 @@
           <w:i w:val="0"/>
           <w:sz w:val="24"/>
         </w:rPr>
-        <w:t>Integrasi nasional akan semakin kuat bila masyarakat merasa diperlakukan adil. Karena itu, pemerataan pembangunan menjadi bagian penting dari menjaga persatuan. Ketika daerah tertinggal tidak mendapat perhatian, masyarakat setempat dapat merasa ditinggalkan oleh negara, dan perasaan ini bila dibiarkan dapat menumbuhkan ketidakpuasan.</w:t>
+        <w:t>Integrasi nasional kian kukuh apabila masyarakat merasa diperlakukan secara adil. Karena itu, pemerataan pembangunan menjadi bagian penting dari menjaga persatuan. Ketika daerah tertinggal tidak mendapat perhatian, masyarakat setempat dapat merasa ditinggalkan oleh negara, dan perasaan ini bila dibiarkan dapat menumbuhkan ketidakpuasan.</w:t>
       </w:r>
     </w:p>
     <w:p>
@@ -5877,7 +5877,7 @@
           <w:i w:val="0"/>
           <w:sz w:val="24"/>
         </w:rPr>
-        <w:t>Pendidikan memiliki peran besar dalam merawat integrasi nasional. Melalui pendidikan, generasi muda dikenalkan pada sejarah bangsa, nilai Pancasila, dan bahaya perpecahan. Pendidikan juga membantu masyarakat memahami bahwa perbedaan bukan alasan untuk saling menjauh, melainkan kekuatan bila dikelola dengan baik.</w:t>
+        <w:t>Dunia pendidikan mengemban peran besar dalam memelihara integrasi nasional. Lewat jalur pendidikan, kaum muda diperkenalkan dengan sejarah bangsa, nilai Pancasila, serta ancaman perpecahan. Pendidikan juga membantu masyarakat memahami bahwa perbedaan bukan alasan untuk saling menjauh, melainkan kekuatan bila dikelola dengan baik.</w:t>
       </w:r>
     </w:p>
     <w:p>
@@ -5943,7 +5943,7 @@
           <w:i w:val="0"/>
           <w:sz w:val="24"/>
         </w:rPr>
-        <w:t>Integrasi nasional adalah proses menyatukan keberagaman menjadi satu kesatuan bangsa tanpa menghapus perbedaan. Prosesnya didorong oleh rasa senasib, bahasa pemersatu, dan nilai Pancasila, tetapi dihambat oleh ketimpangan, sentimen sempit, dan berita palsu.</w:t>
+        <w:t>Integrasi nasional ialah proses merangkai keberagaman menjadi satu bangsa yang padu tanpa meniadakan perbedaan. Prosesnya didorong oleh rasa senasib, bahasa pemersatu, dan nilai Pancasila, tetapi dihambat oleh ketimpangan, sentimen sempit, dan berita palsu.</w:t>
       </w:r>
     </w:p>
     <w:p>
@@ -6194,7 +6194,7 @@
           <w:i w:val="0"/>
           <w:sz w:val="24"/>
         </w:rPr>
-        <w:t>Pada masa reformasi, UUD 1945 mengalami empat kali amandemen antara tahun 1999 hingga 2002. Amandemen menyentuh penegasan hak asasi manusia, pembatasan masa jabatan presiden, penataan lembaga negara, dan pengaturan pemilihan umum yang lebih demokratis. Penataan peraturan turunannya kemudian diatur melalui Undang-Undang Nomor 12 Tahun 2011 tentang Pembentukan Peraturan Perundang-undangan.</w:t>
+        <w:t>Pada masa reformasi, UUD 1945 mengalami empat kali amandemen antara tahun 1999 hingga 2002. Amandemen menyentuh penegasan hak asasi manusia, pembatasan masa jabatan presiden, penataan lembaga negara, dan pengaturan pemilihan umum yang lebih demokratis. Penataan aturan turunannya selanjutnya ditetapkan lewat Undang-Undang Nomor 12 Tahun 2011.</w:t>
       </w:r>
     </w:p>
     <w:p>
@@ -6544,7 +6544,7 @@
           <w:i w:val="0"/>
           <w:sz w:val="24"/>
         </w:rPr>
-        <w:t>Pembagian ini bukan sekadar urusan tata negara, melainkan wujud pembatasan kekuasaan. Setiap lembaga memiliki kewenangan tersendiri dan saling mengawasi, sehingga kekuasaan tidak berjalan tanpa kendali.</w:t>
+        <w:t>Pemisahan ini bukan semata soal tata negara, tetapi merupakan bentuk pengekangan kekuasaan. Setiap lembaga memiliki kewenangan tersendiri dan saling mengawasi, sehingga kekuasaan tidak berjalan tanpa kendali.</w:t>
       </w:r>
     </w:p>
     <w:p>
@@ -6778,7 +6778,7 @@
           <w:i w:val="0"/>
           <w:sz w:val="24"/>
         </w:rPr>
-        <w:t>Kesadaran berkonstitusi berarti kesediaan untuk memahami, menghormati, dan menjalankan aturan dasar negara. Bagi mahasiswa, kesadaran ini dapat dilatih dari hal sederhana, seperti menaati aturan kampus, menyampaikan pendapat secara santun, dan menyelesaikan perbedaan melalui jalur yang sah.</w:t>
+        <w:t>Kesadaran berkonstitusi mengandung arti kesediaan memahami, menghormati, serta menjalankan aturan dasar negara. Pada lingkup mahasiswa, kesadaran semacam itu diasah lewat tindakan kecil, antara lain mematuhi tata tertib kampus, menyuarakan pandangan dengan sopan, dan menuntaskan perselisihan melalui mekanisme yang sah.</w:t>
       </w:r>
     </w:p>
     <w:p>
@@ -6844,7 +6844,7 @@
           <w:i w:val="0"/>
           <w:sz w:val="24"/>
         </w:rPr>
-        <w:t>Salah satu wujud nyata kehadiran konstitusi adalah perlindungan terhadap warga negara. Konstitusi menjamin bahwa setiap orang berhak memperoleh keadilan, pendidikan, rasa aman, dan kebebasan berpendapat. Jaminan ini membuat warga tidak boleh diperlakukan sewenang-wenang oleh kekuasaan.</w:t>
+        <w:t>Salah satu bukti konkret hadirnya konstitusi adalah adanya perlindungan bagi warga negara. Konstitusi memberi jaminan bahwa tiap orang berhak atas keadilan, pendidikan, rasa aman, serta kemerdekaan menyatakan pendapat. Jaminan tersebut menutup peluang kekuasaan memperlakukan warga secara semena-mena.</w:t>
       </w:r>
     </w:p>
     <w:p>
@@ -6860,7 +6860,7 @@
           <w:i w:val="0"/>
           <w:sz w:val="24"/>
         </w:rPr>
-        <w:t>Namun perlindungan itu hanya berjalan baik bila warga memahami haknya. Banyak orang mengalami ketidakadilan tetapi tidak menyadari bahwa hak mereka dilindungi konstitusi, atau tidak mengetahui cara memperjuangkannya. Karena itu, pemahaman terhadap konstitusi menjadi penting agar warga dapat membela diri melalui jalur yang sah.</w:t>
+        <w:t>Namun perlindungan tersebut baru efektif manakala warga mengerti haknya. Tidak sedikit orang menanggung ketidakadilan tanpa menyadari bahwa konstitusi melindungi hak mereka, atau tanpa mengetahui cara menuntutnya. Atas dasar itu, penguasaan terhadap konstitusi menjadi krusial supaya warga mampu membela diri lewat jalur yang sah.</w:t>
       </w:r>
     </w:p>
     <w:p>
@@ -6876,7 +6876,7 @@
           <w:i w:val="0"/>
           <w:sz w:val="24"/>
         </w:rPr>
-        <w:t>Konstitusi juga melindungi kelompok minoritas dari dominasi mayoritas. Dalam demokrasi, suara terbanyak memang menentukan, tetapi konstitusi memastikan hak kelompok kecil tetap dihormati. Inilah yang menjaga agar demokrasi tidak berubah menjadi penindasan atas nama suara mayoritas.</w:t>
+        <w:t>Konstitusi sekaligus menaungi kelompok minoritas dari dominasi mayoritas. Pada demokrasi, suara mayoritas memang menjadi penentu, namun konstitusi menjamin hak kelompok minoritas tetap dijunjung. Hal inilah yang mencegah demokrasi menjelma menjadi penindasan yang berdalih suara mayoritas.</w:t>
       </w:r>
     </w:p>
     <w:p>
@@ -6942,7 +6942,7 @@
           <w:i w:val="0"/>
           <w:sz w:val="24"/>
         </w:rPr>
-        <w:t>Pembatasan kekuasaan diwujudkan melalui pembagian tugas antarlembaga negara serta mekanisme saling mengawasi. Presiden menjalankan pemerintahan, Dewan Perwakilan Rakyat membuat undang-undang dan mengawasi, sedangkan lembaga peradilan menegakkan keadilan. Tidak ada satu lembaga pun yang boleh menguasai seluruh kekuasaan negara.</w:t>
+        <w:t>Pembatasan kekuasaan diwujudkan melalui pembagian tugas antarlembaga negara serta mekanisme saling mengawasi. Presiden mengendalikan jalannya pemerintahan, Dewan Perwakilan Rakyat menyusun undang-undang sekaligus mengawasi, sementara lembaga peradilan menegakkan keadilan. Tidak ada satu lembaga pun yang boleh menguasai seluruh kekuasaan negara.</w:t>
       </w:r>
     </w:p>
     <w:p>
@@ -6992,7 +6992,7 @@
           <w:i w:val="0"/>
           <w:sz w:val="24"/>
         </w:rPr>
-        <w:t>Konstitusi mengatur hubungan timbal balik antara negara dan warga negara. Negara memiliki kewenangan membuat aturan dan menyelenggarakan pemerintahan, tetapi kewenangan itu dibatasi agar tidak melanggar hak warga. Sebaliknya, warga negara wajib menaati aturan, tetapi juga berhak menuntut pelayanan dan perlindungan.</w:t>
+        <w:t>Konstitusi menata relasi dua arah antara negara dengan warganya. Negara memang berwenang menyusun aturan dan menjalankan pemerintahan, tetapi kewenangan tersebut dipagari supaya tidak menabrak hak warga. Sebaliknya, warga berkewajiban mematuhi aturan, namun pada saat yang sama berhak menuntut pelayanan serta perlindungan.</w:t>
       </w:r>
     </w:p>
     <w:p>
@@ -7008,7 +7008,7 @@
           <w:i w:val="0"/>
           <w:sz w:val="24"/>
         </w:rPr>
-        <w:t>Hubungan ini idealnya berjalan saling menghormati. Negara hadir untuk melayani, sedangkan warga berpartisipasi secara bertanggung jawab. Ketika keduanya menjalankan perannya dengan baik, kehidupan bernegara berjalan tertib dan kepercayaan publik terhadap pemerintah pun terjaga.</w:t>
+        <w:t>Hubungan ini idealnya berjalan saling menghormati. Negara berada untuk melayani, sementara warga turut serta secara bertanggung jawab. Tatkala kedua pihak menunaikan perannya secara baik, roda kehidupan bernegara berputar tertib dan kepercayaan rakyat kepada pemerintah ikut terpelihara.</w:t>
       </w:r>
     </w:p>
     <w:p>
@@ -7277,7 +7277,7 @@
           <w:i w:val="0"/>
           <w:sz w:val="24"/>
         </w:rPr>
-        <w:t>Berbeda dari hak warga negara yang diperoleh karena status kewarganegaraan, hak asasi bersifat universal dan tidak dapat dicabut oleh negara mana pun. Indonesia mengakui dan melindungi hak asasi melalui UUD NRI Tahun 1945 dan Undang-Undang Nomor 39 Tahun 1999 tentang Hak Asasi Manusia, serta membentuk Komisi Nasional Hak Asasi Manusia sebagai lembaga pengawas.</w:t>
+        <w:t>Berbeda dari hak warga negara yang diperoleh karena status kewarganegaraan, hak asasi bersifat universal dan tidak dapat dicabut oleh negara mana pun. Perlindungan hak asasi di Indonesia ditopang UUD NRI Tahun 1945 beserta Undang-Undang Nomor 39 Tahun 1999, dengan Komisi Nasional Hak Asasi Manusia sebagai pemantaunya.</w:t>
       </w:r>
     </w:p>
     <w:p>
@@ -7827,7 +7827,7 @@
           <w:i w:val="0"/>
           <w:sz w:val="24"/>
         </w:rPr>
-        <w:t>Di tingkat nasional, instrumen hak asasi mencakup UUD NRI Tahun 1945 dan Undang-Undang Nomor 39 Tahun 1999 tentang Hak Asasi Manusia, serta keberadaan Komisi Nasional Hak Asasi Manusia. Keselarasan antara instrumen nasional dan internasional menunjukkan bahwa isu kemanusiaan telah menjadi perhatian bersama, bukan hanya kepentingan satu negara.</w:t>
+        <w:t>Di lingkup dalam negeri, perangkat hak asasi bertumpu pada UUD NRI Tahun 1945, ditambah Undang-Undang Nomor 39 Tahun 1999 serta kehadiran Komisi Nasional Hak Asasi Manusia. Keselarasan antara instrumen nasional dan internasional menunjukkan bahwa isu kemanusiaan telah menjadi perhatian bersama, bukan hanya kepentingan satu negara.</w:t>
       </w:r>
     </w:p>
     <w:p>
@@ -8059,7 +8059,7 @@
           <w:i w:val="0"/>
           <w:sz w:val="24"/>
         </w:rPr>
-        <w:t>Dalam kehidupan demokrasi, hak dan kewajiban harus berjalan seimbang. Demokrasi memberi ruang bagi warga negara untuk menyampaikan pendapat, memilih pemimpin, dan mengawasi pemerintahan. Namun, hak-hak itu menuntut kedewasaan agar tidak berubah menjadi kebebasan tanpa batas yang justru merugikan orang lain.</w:t>
+        <w:t>Dalam kehidupan demokrasi, hak dan kewajiban harus berjalan seimbang. Demokrasi membuka ruang bagi warga untuk menyuarakan pendapat, menentukan pemimpin, serta mengawasi jalannya pemerintahan. Namun, hak-hak itu menuntut kedewasaan agar tidak berubah menjadi kebebasan tanpa batas yang justru merugikan orang lain.</w:t>
       </w:r>
     </w:p>
     <w:p>
@@ -8075,7 +8075,7 @@
           <w:i w:val="0"/>
           <w:sz w:val="24"/>
         </w:rPr>
-        <w:t>Dalam pemilihan umum, misalnya, warga negara memiliki hak memilih, tetapi juga berkewajiban menggunakan hak itu secara bertanggung jawab, tidak menjual suara, dan tidak mudah terprovokasi. Keseimbangan inilah yang membuat demokrasi berjalan sehat, bukan sekadar ajang perebutan suara.</w:t>
+        <w:t>Pada pemilihan umum, sebagai contoh, warga memang berhak memberikan suara, namun sekaligus wajib memakai hak itu secara bertanggung jawab, tidak memperjualbelikan suara, dan tidak gampang terhasut. Keseimbangan inilah yang membuat demokrasi berjalan sehat, bukan sekadar ajang perebutan suara.</w:t>
       </w:r>
     </w:p>
     <w:p>
@@ -8125,7 +8125,7 @@
           <w:i w:val="0"/>
           <w:sz w:val="24"/>
         </w:rPr>
-        <w:t>Selain hak dan kewajiban yang diatur hukum, warga negara juga memiliki tanggung jawab sosial. Tanggung jawab ini tampak dari kepedulian terhadap lingkungan, kesediaan membantu sesama, dan keterlibatan dalam kegiatan masyarakat. Tanggung jawab sosial memperkuat hubungan antarwarga dan menjaga semangat gotong royong.</w:t>
+        <w:t>Di luar hak dan kewajiban yang ditetapkan hukum, warga negara turut memikul tanggung jawab sosial. Tanggung jawab tersebut terbaca pada kepedulian terhadap lingkungan, keikhlasan membantu sesama, serta keterlibatan dalam aktivitas kemasyarakatan. Tanggung jawab sosial mengeratkan jalinan antarwarga dan merawat semangat gotong royong.</w:t>
       </w:r>
     </w:p>
     <w:p>
@@ -8141,7 +8141,7 @@
           <w:i w:val="0"/>
           <w:sz w:val="24"/>
         </w:rPr>
-        <w:t>Jika setiap orang hanya memikirkan diri sendiri, kehidupan bersama akan melemah. Sebaliknya, ketika warga saling peduli, nilai kebersamaan tetap hidup. Tanggung jawab sosial inilah yang membuat hak dan kewajiban tidak berhenti pada urusan hukum, tetapi juga menyentuh kualitas kehidupan bermasyarakat.</w:t>
+        <w:t>Andai tiap orang cuma mementingkan dirinya, kehidupan bersama akan rapuh. Sebaliknya, manakala warga saling memperhatikan, nilai kebersamaan akan tetap menyala. Tanggung jawab sosial inilah yang membuat hak dan kewajiban tidak berhenti pada urusan hukum, tetapi juga menyentuh kualitas kehidupan bermasyarakat.</w:t>
       </w:r>
     </w:p>
     <w:p>
@@ -8157,7 +8157,7 @@
           <w:i w:val="0"/>
           <w:sz w:val="24"/>
         </w:rPr>
-        <w:t>Mahasiswa dapat mewujudkan tanggung jawab sosial melalui kegiatan pengabdian, aksi sosial, dan kepedulian terhadap persoalan di sekitarnya. Bagi calon konselor, kepedulian sosial ini menjadi modal penting dalam memahami dan membantu individu yang menghadapi kesulitan.</w:t>
+        <w:t>Mahasiswa bisa menunaikan tanggung jawab sosial lewat kegiatan pengabdian, gerakan sosial, serta kepedulian pada persoalan di sekelilingnya. Bagi calon konselor, kepedulian sosial ini menjadi modal penting dalam memahami dan membantu individu yang menghadapi kesulitan.</w:t>
       </w:r>
     </w:p>
     <w:p>
@@ -8191,7 +8191,7 @@
           <w:i w:val="0"/>
           <w:sz w:val="24"/>
         </w:rPr>
-        <w:t>Hak dan kewajiban warga negara berjalan seiring dalam kerangka tanggung jawab. Hak asasi manusia memiliki cakupan universal yang melekat pada setiap manusia, dijamin oleh UUD NRI Tahun 1945 dan Undang-Undang Nomor 39 Tahun 1999.</w:t>
+        <w:t>Hak dan kewajiban warga negara berjalan seiring dalam kerangka tanggung jawab. Hak asasi manusia bersifat universal dan melekat pada tiap insan, dengan jaminan yang tertuang dalam UUD NRI Tahun 1945 serta Undang-Undang Nomor 39 Tahun 1999.</w:t>
       </w:r>
     </w:p>
     <w:p>
@@ -8360,7 +8360,7 @@
           <w:i w:val="0"/>
           <w:sz w:val="24"/>
         </w:rPr>
-        <w:t>Negara hukum berpijak pada sejumlah prinsip yang memastikan hukum benar-benar menjaga keadilan. Prinsip persamaan di hadapan hukum menegaskan bahwa semua orang memiliki kedudukan yang sama tanpa memandang status. Prinsip perlindungan hak menuntut negara menjamin hak dasar warga. Prinsip pembatasan kekuasaan mencegah kekuasaan terpusat melalui mekanisme saling mengawasi.</w:t>
+        <w:t>Negara hukum berpijak pada sejumlah prinsip yang memastikan hukum benar-benar menjaga keadilan. Asas kesetaraan di mata hukum menegaskan bahwa tiap orang berkedudukan sama tanpa memandang status. Prinsip perlindungan hak menuntut negara menjamin hak dasar warga. Prinsip pembatasan kekuasaan mencegah kekuasaan terpusat melalui mekanisme saling mengawasi.</w:t>
       </w:r>
     </w:p>
     <w:p>
@@ -8768,7 +8768,7 @@
           <w:i w:val="0"/>
           <w:sz w:val="24"/>
         </w:rPr>
-        <w:t>Supremasi hukum menyatakan bahwa hukum berada di posisi tertinggi dalam kehidupan bernegara. Tidak ada kekuasaan atau golongan yang boleh berada di atas hukum. Ketika hukum ditegakkan tanpa pandang bulu, masyarakat merasa aman dan percaya pada negara. Sebaliknya, hukum yang tajam ke bawah tetapi tumpul ke atas akan mengikis kepercayaan publik.</w:t>
+        <w:t>Supremasi hukum menyatakan bahwa hukum berada di posisi tertinggi dalam kehidupan bernegara. Tidak ada kekuasaan atau golongan yang boleh berada di atas hukum. Ketika hukum ditegakkan tanpa pandang bulu, masyarakat merasa aman dan percaya pada negara. Sebaliknya, hukum yang galak kepada rakyat kecil namun lembek kepada penguasa akan menggerus kepercayaan publik.</w:t>
       </w:r>
     </w:p>
     <w:p>
@@ -9084,7 +9084,7 @@
           <w:i w:val="0"/>
           <w:sz w:val="24"/>
         </w:rPr>
-        <w:t>Penegakan hukum yang adil membutuhkan lembaga peradilan yang independen. Hakim harus bebas dari tekanan politik, ekonomi, maupun kepentingan pribadi agar putusan yang dihasilkan benar-benar berdasarkan fakta dan hukum. Tanpa independensi, masyarakat akan kehilangan tempat untuk mencari keadilan.</w:t>
+        <w:t>Penegakan hukum yang adil membutuhkan lembaga peradilan yang independen. Hakim wajib lepas dari tekanan politik, ekonomi, maupun pamrih pribadi supaya putusannya sungguh berpijak pada fakta dan hukum. Tanpa independensi, masyarakat akan kehilangan tempat untuk mencari keadilan.</w:t>
       </w:r>
     </w:p>
     <w:p>
@@ -9198,7 +9198,7 @@
           <w:i w:val="0"/>
           <w:sz w:val="24"/>
         </w:rPr>
-        <w:t>Bagi mahasiswa, memahami prinsip ini membantu menumbuhkan sikap kritis yang sehat terhadap praktik hukum. Ketika ada proses hukum yang dinilai tidak adil, mahasiswa dapat menyoroti melalui cara yang sah dan berbasis data, bukan dengan hasutan yang justru merusak proses peradilan.</w:t>
+        <w:t>Bagi mahasiswa, menguasai asas ini menolong tumbuhnya sikap kritis yang sehat terhadap praktik hukum. Ketika ada proses hukum yang dinilai tidak adil, mahasiswa dapat menyoroti melalui cara yang sah dan berbasis data, bukan dengan hasutan yang justru merusak proses peradilan.</w:t>
       </w:r>
     </w:p>
     <w:p>
@@ -9232,7 +9232,7 @@
           <w:i w:val="0"/>
           <w:sz w:val="24"/>
         </w:rPr>
-        <w:t>Kepercayaan publik terhadap hukum adalah modal berharga yang mudah rusak. Sekali masyarakat merasa hukum tidak adil, kepercayaan itu sulit dipulihkan. Padahal tanpa kepercayaan, masyarakat cenderung mengambil jalan sendiri yang justru menambah persoalan.</w:t>
+        <w:t>Kepercayaan publik terhadap hukum adalah modal berharga yang mudah rusak. Begitu masyarakat menilai hukum tidak adil, kepercayaan itu payah untuk dipulihkan. Padahal bila kepercayaan hilang, masyarakat condong menempuh jalannya sendiri yang malah memperbanyak persoalan.</w:t>
       </w:r>
     </w:p>
     <w:p>
@@ -9248,7 +9248,7 @@
           <w:i w:val="0"/>
           <w:sz w:val="24"/>
         </w:rPr>
-        <w:t>Membangun kepercayaan menuntut bukti, bukan sekadar janji. Penegakan hukum yang konsisten, transparan, dan tidak pandang bulu adalah cara paling nyata untuk memulihkannya. Ketika masyarakat melihat bahwa pihak yang bersalah pun diproses secara adil, kepercayaan akan tumbuh dengan sendirinya.</w:t>
+        <w:t>Membangun kepercayaan menuntut bukti, bukan sekadar janji. Penegakan hukum yang ajeg, terbuka, serta tidak tebang pilih merupakan jalan paling konkret untuk memulihkannya. Manakala masyarakat menyaksikan pihak bersalah turut diproses secara adil, kepercayaan pun akan bersemi dengan sendirinya.</w:t>
       </w:r>
     </w:p>
     <w:p>
@@ -9401,7 +9401,7 @@
           <w:i w:val="0"/>
           <w:sz w:val="24"/>
         </w:rPr>
-        <w:t>Wawasan nusantara adalah cara pandang bangsa Indonesia terhadap diri dan lingkungannya berdasarkan Pancasila dan UUD NRI Tahun 1945, dengan mengutamakan persatuan dan kesatuan wilayah. Sebagai negara kepulauan terbesar di dunia, Indonesia memiliki tantangan geografis yang unik, dengan ribuan pulau dan keragaman budaya yang menjadi kekayaan sekaligus tantangan.</w:t>
+        <w:t>Wawasan nusantara merupakan cara bangsa Indonesia memaknai diri serta lingkungannya yang berlandas Pancasila dan UUD NRI Tahun 1945, seraya menomorsatukan keutuhan wilayah. Sebagai negara kepulauan terbesar di dunia, Indonesia memiliki tantangan geografis yang unik, dengan ribuan pulau dan keragaman budaya yang menjadi kekayaan sekaligus tantangan.</w:t>
       </w:r>
     </w:p>
     <w:p>
@@ -9517,7 +9517,7 @@
           <w:i w:val="0"/>
           <w:sz w:val="24"/>
         </w:rPr>
-        <w:t>Geostrategi adalah strategi nasional yang disusun berdasarkan kondisi geografis dan berbagai aspek kehidupan bangsa untuk mencapai tujuan nasional. Salah satu wujudnya adalah ketahanan nasional, yaitu kemampuan bangsa menjaga keberlangsungan hidup, persatuan, dan stabilitas dalam menghadapi tantangan dari dalam maupun luar. Landasan pertahanannya antara lain diatur dalam Undang-Undang Nomor 3 Tahun 2002 tentang Pertahanan Negara.</w:t>
+        <w:t>Geostrategi adalah strategi nasional yang disusun berdasarkan kondisi geografis dan berbagai aspek kehidupan bangsa untuk mencapai tujuan nasional. Salah satu wujudnya adalah ketahanan nasional, yaitu kemampuan bangsa menjaga keberlangsungan hidup, persatuan, dan stabilitas dalam menghadapi tantangan dari dalam maupun luar. Pijakan pertahanannya, salah satunya, diatur lewat Undang-Undang Nomor 3 Tahun 2002.</w:t>
       </w:r>
     </w:p>
     <w:p>
@@ -9975,7 +9975,7 @@
           <w:i w:val="0"/>
           <w:sz w:val="24"/>
         </w:rPr>
-        <w:t>Sebagai negara kepulauan, sebagian besar wilayah Indonesia adalah laut. Karena itu, kesadaran maritim menjadi bagian penting dari wawasan nusantara. Laut bukan sekadar pemisah, melainkan penghubung yang menyatukan kehidupan bangsa, sekaligus sumber pangan, energi, dan jalur perdagangan yang harus dijaga.</w:t>
+        <w:t>Selaku negara kepulauan, mayoritas wilayah Indonesia berupa lautan. Dengan alasan itu, kesadaran kemaritiman menjelma bagian penting dari wawasan nusantara. Laut bukan sekadar pemisah, melainkan penghubung yang menyatukan kehidupan bangsa, sekaligus sumber pangan, energi, dan jalur perdagangan yang harus dijaga.</w:t>
       </w:r>
     </w:p>
     <w:p>
@@ -10157,7 +10157,7 @@
           <w:i w:val="0"/>
           <w:sz w:val="24"/>
         </w:rPr>
-        <w:t>Daerah perbatasan, pulau kecil, dan wilayah terpencil perlu mendapat perhatian agar masyarakat di sana juga merasakan manfaat pembangunan. Ketika seluruh wilayah merasa diperhatikan, rasa memiliki terhadap bangsa akan tumbuh lebih kuat, dan persatuan nasional menjadi lebih kokoh.</w:t>
+        <w:t>Daerah perbatasan, pulau kecil, dan wilayah terpencil perlu mendapat perhatian agar masyarakat di sana juga merasakan manfaat pembangunan. Tatkala segenap daerah merasa diperhatikan, rasa memiliki terhadap bangsa akan menguat, dan persatuan nasional pun bertambah kokoh.</w:t>
       </w:r>
     </w:p>
     <w:p>
@@ -10173,7 +10173,7 @@
           <w:i w:val="0"/>
           <w:sz w:val="24"/>
         </w:rPr>
-        <w:t>Pembangunan yang merata juga memperkuat ketahanan nasional. Masyarakat yang sejahtera dan merasa diperlakukan adil cenderung lebih tahan terhadap provokasi yang ingin memecah belah. Dengan demikian, pemerataan pembangunan bukan sekadar urusan ekonomi, melainkan bagian dari menjaga keutuhan bangsa.</w:t>
+        <w:t>Pembangunan yang merata juga memperkuat ketahanan nasional. Masyarakat yang sejahtera dan merasa diperlakukan adil cenderung lebih tahan terhadap provokasi yang ingin memecah belah. Dengan begitu, pemerataan pembangunan bukan semata perkara ekonomi, melainkan bagian dari merawat keutuhan bangsa.</w:t>
       </w:r>
     </w:p>
     <w:p>
@@ -10223,7 +10223,7 @@
           <w:i w:val="0"/>
           <w:sz w:val="24"/>
         </w:rPr>
-        <w:t>Ketahanan nasional sangat dipengaruhi oleh ketahanan ekonomi. Negara dengan ekonomi yang rapuh mudah tertekan oleh krisis dan ketergantungan pada pihak luar. Karena itu, kemandirian ekonomi yang dibangun melalui penguatan usaha kecil, peningkatan kualitas sumber daya manusia, dan pengelolaan kekayaan alam yang adil menjadi bagian penting dari geostrategi.</w:t>
+        <w:t>Ketahanan nasional sangat dipengaruhi oleh ketahanan ekonomi. Negara yang fondasi ekonominya rapuh gampang tergoncang oleh krisis serta ketergantungan kepada pihak asing. Karena itu, kemandirian ekonomi yang dibangun melalui penguatan usaha kecil, peningkatan kualitas sumber daya manusia, dan pengelolaan kekayaan alam yang adil menjadi bagian penting dari geostrategi.</w:t>
       </w:r>
     </w:p>
     <w:p>
@@ -10239,7 +10239,7 @@
           <w:i w:val="0"/>
           <w:sz w:val="24"/>
         </w:rPr>
-        <w:t>Selain ekonomi, ketahanan sosial budaya juga tidak boleh diabaikan. Kemampuan masyarakat mempertahankan nilai, tradisi, dan jati diri di tengah perubahan zaman menjadi benteng dari dalam. Sikap selektif terhadap budaya luar, tanpa menutup diri dari kemajuan, menjadi kunci agar bangsa tetap maju tanpa kehilangan identitas.</w:t>
+        <w:t>Di luar ekonomi, ketahanan sosial budaya pun tak boleh disepelekan. Kesanggupan masyarakat menjaga nilai, tradisi, serta jati diri di tengah pergeseran zaman berfungsi sebagai benteng dari dalam. Kemampuan memilah budaya asing, tanpa menolak kemajuan, menjadi syarat agar bangsa terus berkembang tanpa kehilangan jati dirinya.</w:t>
       </w:r>
     </w:p>
     <w:p>
@@ -10355,7 +10355,7 @@
           <w:i w:val="0"/>
           <w:sz w:val="24"/>
         </w:rPr>
-        <w:t>Wawasan nusantara adalah cara pandang yang menempatkan seluruh wilayah Indonesia sebagai satu kesatuan, sekaligus menjadi geopolitik Indonesia. Geostrategi diwujudkan melalui ketahanan nasional yang mencakup dimensi ideologi, politik, ekonomi, sosial budaya, serta pertahanan dan keamanan.</w:t>
+        <w:t>Wawasan nusantara adalah cara pandang yang menempatkan seluruh wilayah Indonesia sebagai satu kesatuan, sekaligus menjadi geopolitik Indonesia. Geostrategi dijelmakan lewat ketahanan nasional yang merangkum dimensi ideologi, politik, ekonomi, sosial budaya, di samping pertahanan dan keamanan.</w:t>
       </w:r>
     </w:p>
     <w:p>
@@ -10458,7 +10458,7 @@
           <w:i w:val="0"/>
           <w:sz w:val="24"/>
         </w:rPr>
-        <w:t>Korupsi adalah penyalahgunaan kekuasaan, jabatan, atau kepercayaan untuk memperoleh keuntungan pribadi atau kelompok yang merugikan kepentingan umum. Korupsi tidak selalu berbentuk pencurian uang secara langsung. Suap, gratifikasi, penggelapan, penyalahgunaan wewenang, dan penggelembungan anggaran termasuk dalam wujud korupsi.</w:t>
+        <w:t>Korupsi merupakan penyelewengan kuasa, kedudukan, atau amanah guna meraup keuntungan pribadi maupun kelompok yang berakibat merugikan kepentingan orang banyak. Korupsi tidak selalu berbentuk pencurian uang secara langsung. Suap, gratifikasi, penggelapan, penyalahgunaan wewenang, dan penggelembungan anggaran termasuk dalam wujud korupsi.</w:t>
       </w:r>
     </w:p>
     <w:p>
@@ -10778,7 +10778,7 @@
           <w:i w:val="0"/>
           <w:sz w:val="24"/>
         </w:rPr>
-        <w:t>Korupsi hadir dalam beragam bentuk, mulai dari suap untuk memuluskan urusan, gratifikasi yang menyamar sebagai hadiah, hingga pemerasan oleh pihak yang memiliki kewenangan. Mengenali berbagai bentuk ini penting agar masyarakat tidak menganggap praktik tertentu sebagai hal yang wajar, misalnya memberi uang pelicin untuk mempercepat layanan.</w:t>
+        <w:t>Korupsi muncul dalam aneka rupa, terbentang dari suap untuk melancarkan urusan, gratifikasi yang berkedok hadiah, sampai pemerasan oleh pihak yang memegang wewenang. Mengenali berbagai bentuk ini penting agar masyarakat tidak menganggap praktik tertentu sebagai hal yang wajar, misalnya memberi uang pelicin untuk mempercepat layanan.</w:t>
       </w:r>
     </w:p>
     <w:p>
@@ -10794,7 +10794,7 @@
           <w:i w:val="0"/>
           <w:sz w:val="24"/>
         </w:rPr>
-        <w:t>Dampak korupsi terasa pada banyak sisi. Secara ekonomi, anggaran yang seharusnya untuk pendidikan dan kesehatan justru mengalir ke pihak tertentu. Secara sosial, korupsi memperlebar ketimpangan dan menurunkan kepercayaan terhadap negara. Secara moral, korupsi menumbuhkan budaya permisif terhadap ketidakjujuran. Rakyat kecil sering kali menjadi pihak yang paling dirugikan.</w:t>
+        <w:t>Dampak korupsi terasa pada banyak sisi. Di bidang ekonomi, dana yang mestinya menopang pendidikan dan kesehatan malah berbelok ke segelintir pihak. Secara sosial, korupsi memperlebar ketimpangan dan menurunkan kepercayaan terhadap negara. Secara moral, korupsi menumbuhkan budaya permisif terhadap ketidakjujuran. Rakyat kecil sering kali menjadi pihak yang paling dirugikan.</w:t>
       </w:r>
     </w:p>
     <w:p>
@@ -11152,7 +11152,7 @@
           <w:i w:val="0"/>
           <w:sz w:val="24"/>
         </w:rPr>
-        <w:t>Nilai-nilai ini tampak sederhana, tetapi justru di situlah pendidikan antikorupsi diuji. Gaya hidup berlebihan dan keinginan kaya secara instan sering menjadi pintu masuk perilaku koruptif, sehingga penanaman nilai sejak masa kuliah menjadi sangat penting.</w:t>
+        <w:t>Nilai-nilai ini tampak sederhana, tetapi justru di situlah pendidikan antikorupsi diuji. Pola hidup mewah dan hasrat kaya secara kilat kerap membuka celah perilaku koruptif, sehingga penyemaian nilai sejak bangku kuliah terasa sangat mendesak.</w:t>
       </w:r>
     </w:p>
     <w:p>
@@ -11186,7 +11186,7 @@
           <w:i w:val="0"/>
           <w:sz w:val="24"/>
         </w:rPr>
-        <w:t>Korupsi sering dibayangkan sebagai kejahatan pejabat besar, padahal benihnya muncul dalam keseharian. Menyontek, menitipkan tanda tangan kehadiran, atau memanipulasi laporan kegiatan adalah contoh kecil yang mencerminkan sikap tidak jujur. Bila dianggap sepele, kebiasaan ini dapat berkembang menjadi penyimpangan yang lebih besar ketika seseorang memegang wewenang.</w:t>
+        <w:t>Korupsi lazim dibayangkan sebagai ulah pejabat tinggi, padahal bibitnya bersemi dalam keseharian. Menyontek, menitip tanda tangan kehadiran, atau memanipulasi laporan kegiatan tergolong contoh kecil yang mencerminkan ketidakjujuran. Bila dianggap sepele, kebiasaan ini dapat berkembang menjadi penyimpangan yang lebih besar ketika seseorang memegang wewenang.</w:t>
       </w:r>
     </w:p>
     <w:p>
@@ -11202,7 +11202,7 @@
           <w:i w:val="0"/>
           <w:sz w:val="24"/>
         </w:rPr>
-        <w:t>Karena itu, pendidikan antikorupsi harus menyentuh perilaku sehari-hari, bukan hanya membahas kasus besar yang terasa jauh. Kesadaran untuk jujur dalam hal kecil adalah latihan paling nyata dalam membangun integritas.</w:t>
+        <w:t>Maka dari itu, pendidikan antikorupsi mesti menjangkau perilaku keseharian, bukan semata mengupas kasus kakap yang terasa berjarak. Kesadaran untuk jujur dalam hal kecil adalah latihan paling nyata dalam membangun integritas.</w:t>
       </w:r>
     </w:p>
     <w:p>
@@ -11236,7 +11236,7 @@
           <w:i w:val="0"/>
           <w:sz w:val="24"/>
         </w:rPr>
-        <w:t>Perguruan tinggi memikul tanggung jawab menanamkan nilai antikorupsi, tidak hanya melalui materi kuliah, tetapi juga melalui budaya dan tata kelola kampus. Kampus yang membiarkan plagiarisme atau kecurangan organisasi sebenarnya sedang menormalkan benih korupsi, sedangkan kampus yang tegas terhadap ketidakjujuran sedang menanam fondasi integritas.</w:t>
+        <w:t>Perguruan tinggi memikul tanggung jawab menanamkan nilai antikorupsi, tidak hanya melalui materi kuliah, tetapi juga melalui budaya dan tata kelola kampus. Kampus yang membiarkan penjiplakan atau kecurangan organisasi sejatinya tengah melumrahkan bibit korupsi, sedangkan kampus yang tegas terhadap ketidakjujuran tengah menanam pondasi integritas.</w:t>
       </w:r>
     </w:p>
     <w:p>
@@ -11336,7 +11336,7 @@
           <w:i w:val="0"/>
           <w:sz w:val="24"/>
         </w:rPr>
-        <w:t>Pencegahan korupsi menuntut pendekatan yang menyeluruh, bukan hanya penindakan. Dari sisi sistem, diperlukan transparansi anggaran, pelayanan publik yang sederhana, dan pengawasan yang ketat agar peluang penyimpangan dipersempit. Dari sisi manusia, diperlukan penanaman nilai integritas sejak dini melalui pendidikan dan keteladanan.</w:t>
+        <w:t>Pencegahan korupsi menuntut pendekatan yang menyeluruh, bukan hanya penindakan. Ditinjau dari sistem, diperlukan keterbukaan anggaran, pelayanan publik yang ringkas, serta pengawasan yang ketat supaya ruang penyimpangan menyempit. Ditinjau dari sisi pelaku, dibutuhkan penyemaian nilai integritas sejak dini lewat pendidikan dan keteladanan.</w:t>
       </w:r>
     </w:p>
     <w:p>
@@ -11352,7 +11352,7 @@
           <w:i w:val="0"/>
           <w:sz w:val="24"/>
         </w:rPr>
-        <w:t>Keduanya harus berjalan bersama. Sistem yang baik tanpa manusia yang jujur akan mudah disiasati, sedangkan manusia yang jujur tanpa sistem yang baik akan kesulitan bertahan. Karena itu, pemberantasan korupsi yang berhasil selalu menggabungkan perbaikan tata kelola dengan pembentukan karakter.</w:t>
+        <w:t>Keduanya harus berjalan bersama. Tata kelola yang rapi tetap rentan diakali apabila pelakunya tidak jujur, sementara pribadi jujur akan kewalahan jika berada dalam tata kelola yang buruk. Oleh karena itu, pemberantasan korupsi yang berhasil senantiasa memadukan pembenahan tata kelola dengan penempaan karakter.</w:t>
       </w:r>
     </w:p>
     <w:p>
@@ -11386,7 +11386,7 @@
           <w:i w:val="0"/>
           <w:sz w:val="24"/>
         </w:rPr>
-        <w:t>Budaya integritas berarti kesesuaian antara perkataan dan perbuatan, serta keberanian untuk tetap jujur meski ada kesempatan untuk curang. Budaya ini tidak terbentuk seketika, melainkan melalui kebiasaan yang dilatih setiap hari. Di lingkungan kampus, ia dimulai dari hal kecil seperti tidak menyontek, tidak memalsukan tanda tangan, dan mengelola organisasi secara transparan.</w:t>
+        <w:t>Budaya integritas mengandung makna keselarasan antara ucapan dan tindakan, sekaligus nyali untuk tetap jujur kendati peluang berbuat curang tersedia. Budaya semacam ini tidak lahir seketika, tetapi tumbuh lewat kebiasaan yang ditempa saban hari. Pada lingkungan kampus, hal itu berawal dari perkara kecil semisal menjauhi sontek-menyontek, tidak memalsu tanda tangan, serta mengurus organisasi secara terbuka.</w:t>
       </w:r>
     </w:p>
     <w:p>
@@ -11402,7 +11402,7 @@
           <w:i w:val="0"/>
           <w:sz w:val="24"/>
         </w:rPr>
-        <w:t>Organisasi kemahasiswaan yang dikelola dengan jujur dan akuntabel menjadi latihan kecil bagi pembentukan karakter pemimpin masa depan. Selain itu, empati terhadap korban korupsi perlu ditumbuhkan, karena banyak masyarakat kecil dirugikan akibat pembangunan yang gagal atau pelayanan publik yang buruk. Dengan kesadaran ini, penolakan terhadap korupsi lahir dari pemahaman, bukan sekadar kewajiban menaati aturan.</w:t>
+        <w:t>Organisasi kemahasiswaan yang dijalankan secara jujur dan akuntabel berfungsi sebagai gladi kecil bagi penempaan karakter pemimpin masa depan. Di samping itu, empati kepada korban korupsi perlu dipupuk, sebab banyak rakyat kecil terimbas akibat pembangunan yang mangkrak atau layanan publik yang buruk. Dengan kesadaran ini, penolakan terhadap korupsi lahir dari pemahaman, bukan sekadar kewajiban menaati aturan.</w:t>
       </w:r>
     </w:p>
     <w:p>
@@ -11436,7 +11436,7 @@
           <w:i w:val="0"/>
           <w:sz w:val="24"/>
         </w:rPr>
-        <w:t>Pemberantasan korupsi di Indonesia melibatkan beberapa lembaga, seperti Komisi Pemberantasan Korupsi, Kepolisian, Kejaksaan, dan pengadilan. Komisi Pemberantasan Korupsi memiliki peran khusus karena berfokus pada pencegahan sekaligus penindakan, terutama untuk perkara yang melibatkan kerugian negara dan pejabat publik.</w:t>
+        <w:t>Upaya memberantas korupsi di Indonesia menggandeng sejumlah lembaga, di antaranya Komisi Pemberantasan Korupsi, Kepolisian, Kejaksaan, serta pengadilan. Komisi Pemberantasan Korupsi mengemban peran khas sebab menggarap pencegahan dan penindakan sekaligus, terutama pada perkara yang menyangkut kerugian negara dan pejabat publik.</w:t>
       </w:r>
     </w:p>
     <w:p>
@@ -11452,7 +11452,7 @@
           <w:i w:val="0"/>
           <w:sz w:val="24"/>
         </w:rPr>
-        <w:t>Namun, pemberantasan korupsi tidak bisa dibebankan hanya kepada aparat. Korupsi adalah persoalan sistemik yang menuntut perbaikan tata kelola pemerintahan, transparansi anggaran, dan partisipasi masyarakat. Keberhasilannya bergantung pada kerja sama antara negara, masyarakat, media, dunia pendidikan, dan sektor swasta.</w:t>
+        <w:t>Akan tetapi, beban pemberantasan korupsi tidak bisa ditimpakan semata kepada aparat. Korupsi tergolong masalah sistemik yang menuntut pembenahan tata kelola pemerintahan, keterbukaan anggaran, serta keterlibatan masyarakat. Keberhasilannya ditentukan oleh sinergi antara negara, masyarakat, media, dunia pendidikan, serta dunia usaha.</w:t>
       </w:r>
     </w:p>
     <w:p>
@@ -11468,7 +11468,7 @@
           <w:i w:val="0"/>
           <w:sz w:val="24"/>
         </w:rPr>
-        <w:t>Setiap warga negara memiliki tanggung jawab untuk menolak dan tidak ikut dalam praktik koruptif. Tanggung jawab ini dapat diwujudkan melalui tindakan sederhana, seperti menolak memberi uang pelicin, melaporkan penyimpangan, dan memilih pemimpin yang berintegritas. Mahasiswa, sebagai calon pemimpin masa depan, perlu membangun keberanian moral untuk melawan korupsi sejak sekarang.</w:t>
+        <w:t>Tiap warga negara mengemban tanggung jawab untuk menampik dan tidak turut serta dalam praktik koruptif. Tanggung jawab semacam itu dapat diejawantahkan lewat langkah sederhana, antara lain menampik pemberian uang pelicin, mengadukan penyimpangan, serta memilih pemimpin yang berintegritas. Mahasiswa, yang merupakan bakal pemimpin masa depan, perlu menempa keberanian moral untuk menentang korupsi mulai saat ini.</w:t>
       </w:r>
     </w:p>
     <w:p>
@@ -11518,7 +11518,7 @@
           <w:i w:val="0"/>
           <w:sz w:val="24"/>
         </w:rPr>
-        <w:t>Budaya akademik yang bersih sangat penting. Bila kampus membiarkan plagiarisme, jual beli nilai, atau penyalahgunaan jabatan organisasi, kampus justru sedang menormalkan benih korupsi. Sebaliknya, kampus yang tegas terhadap ketidakjujuran sedang menanam fondasi integritas yang kuat bagi mahasiswanya.</w:t>
+        <w:t>Budaya akademik yang bersih sangat penting. Apabila kampus memaklumi penjiplakan, jual beli nilai, atau penyalahgunaan jabatan organisasi, ia sebenarnya tengah melumrahkan bibit korupsi. Sebaliknya, kampus yang tegas menindak ketidakjujuran sejatinya tengah meletakkan pondasi integritas yang kokoh bagi mahasiswanya.</w:t>
       </w:r>
     </w:p>
     <w:p>
@@ -11534,7 +11534,7 @@
           <w:i w:val="0"/>
           <w:sz w:val="24"/>
         </w:rPr>
-        <w:t>Karena itu, pendidikan antikorupsi di perguruan tinggi harus bersifat menyeluruh. Ia tidak cukup berupa materi kuliah, tetapi juga harus tercermin dalam sistem, aturan, dan budaya kampus itu sendiri. Konsistensi antara apa yang diajarkan dan apa yang dipraktikkan menjadi kunci keberhasilannya.</w:t>
+        <w:t>Atas alasan itu, pendidikan antikorupsi di perguruan tinggi mesti dijalankan secara menyeluruh. Ia tak memadai bila hanya berwujud materi kuliah, sebab mesti pula terpancar dalam sistem, aturan, dan budaya kampus itu sendiri. Konsistensi antara apa yang diajarkan dan apa yang dipraktikkan menjadi kunci keberhasilannya.</w:t>
       </w:r>
     </w:p>
     <w:p>
@@ -11650,7 +11650,7 @@
           <w:i w:val="0"/>
           <w:sz w:val="24"/>
         </w:rPr>
-        <w:t>Tujuan akhir pendidikan antikorupsi adalah lahirnya generasi yang berintegritas. Generasi berintegritas bukan hanya menolak korupsi ketika kelak menjadi pejabat, tetapi sudah membiasakan kejujuran sejak masih menjadi mahasiswa. Integritas yang dilatih sejak dini akan menjadi karakter yang kuat di kemudian hari.</w:t>
+        <w:t>Sasaran pamungkas pendidikan antikorupsi ialah hadirnya generasi yang berintegritas. Generasi yang berintegritas tidak menanti menjadi pejabat untuk menampik korupsi, melainkan telah mengakrabi kejujuran semasa masih berstatus mahasiswa. Integritas yang diasah sejak dini kelak mengeras menjadi karakter yang kukuh.</w:t>
       </w:r>
     </w:p>
     <w:p>
@@ -11666,7 +11666,7 @@
           <w:i w:val="0"/>
           <w:sz w:val="24"/>
         </w:rPr>
-        <w:t>Membangun generasi berintegritas menuntut keteladanan dari berbagai pihak. Dosen yang adil dalam menilai, kampus yang tegas terhadap kecurangan, dan keluarga yang menanamkan kejujuran semuanya saling melengkapi. Tanpa keteladanan, ajakan untuk berintegritas hanya akan menjadi kata-kata kosong.</w:t>
+        <w:t>Menumbuhkan generasi berintegritas menuntut keteladanan dari banyak pihak. Pengajar yang objektif dalam menilai, institusi yang tegas menindak kecurangan, serta keluarga yang menanam nilai kejujuran saling menyempurnakan satu sama lain. Tanpa contoh nyata, seruan untuk berintegritas hanya akan berhenti sebagai kata-kata hampa.</w:t>
       </w:r>
     </w:p>
     <w:p>
@@ -11682,7 +11682,7 @@
           <w:i w:val="0"/>
           <w:sz w:val="24"/>
         </w:rPr>
-        <w:t>Mahasiswa dapat menjadi bagian dari generasi ini melalui keputusan kecil setiap hari, seperti mengerjakan tugas dengan jujur, mengakui kesalahan, dan berani menolak ajakan berbuat curang. Dari kebiasaan inilah lahir pemimpin masa depan yang bersih dan dapat dipercaya.</w:t>
+        <w:t>Mahasiswa bisa menjadi bagian dari generasi tersebut lewat pilihan kecil saban hari, semisal menggarap tugas secara jujur, mengakui keliru, serta berani menampik ajakan berbuat curang. Dari kebiasaan semacam itulah muncul pemimpin masa depan yang bersih lagi tepercaya.</w:t>
       </w:r>
     </w:p>
     <w:p>
@@ -11716,7 +11716,7 @@
           <w:i w:val="0"/>
           <w:sz w:val="24"/>
         </w:rPr>
-        <w:t>Korupsi adalah penyalahgunaan kepercayaan untuk keuntungan pribadi yang merugikan kepentingan umum, dengan dampak luas pada ekonomi, kehidupan sosial, dan moral bangsa. Pengaturannya tertuang dalam Undang-Undang Nomor 31 Tahun 1999 dan Undang-Undang Nomor 20 Tahun 2001.</w:t>
+        <w:t>Korupsi pada hakikatnya mengkhianati amanah demi laba pribadi yang mencederai kepentingan umum, dan akibatnya menjalar ke perekonomian, kehidupan sosial, sampai moral bangsa. Ketentuannya termaktub dalam Undang-Undang Nomor 31 Tahun 1999 serta Undang-Undang Nomor 20 Tahun 2001.</w:t>
       </w:r>
     </w:p>
     <w:p>
@@ -11732,7 +11732,7 @@
           <w:i w:val="0"/>
           <w:sz w:val="24"/>
         </w:rPr>
-        <w:t>Pencegahan korupsi bertumpu pada penanaman nilai kejujuran, tanggung jawab, dan keberanian, yang dimulai dari kehidupan sehari-hari dan lingkungan kampus. Sebagai penutup mini book ini, materi antikorupsi merangkum semangat seluruh pembahasan, yaitu membentuk mahasiswa menjadi warga negara yang berintegritas, sadar hukum, dan siap berkontribusi bagi bangsa.</w:t>
+        <w:t>Pencegahan korupsi berpijak pada penyemaian nilai kejujuran, tanggung jawab, serta keberanian, yang dimulai dari keseharian dan lingkungan kampus. Sebagai penutup mini book ini, materi antikorupsi merangkum semangat seluruh pembahasan, yaitu membentuk mahasiswa menjadi warga negara yang berintegritas, sadar hukum, dan siap berkontribusi bagi bangsa.</w:t>
       </w:r>
     </w:p>
     <w:p>

</xml_diff>